<commit_message>
tighten LCL clouds section
</commit_message>
<xml_diff>
--- a/doc/DiM_ms20260727.docx
+++ b/doc/DiM_ms20260727.docx
@@ -7123,10 +7123,126 @@
     </w:p>
     <w:p>
       <w:pPr>
-        <w:pStyle w:val="Heading1"/>
+        <w:pStyle w:val="Heading2"/>
       </w:pPr>
       <w:r>
-        <w:t>Discussion</w:t>
+        <w:t>LCL clouds</w:t>
+      </w:r>
+    </w:p>
+    <w:p>
+      <w:pPr>
+        <w:pStyle w:val="BodyText"/>
+        <w:rPr>
+          <w:rFonts w:ascii="Aptos" w:hAnsi="Aptos"/>
+        </w:rPr>
+      </w:pPr>
+      <w:r>
+        <w:rPr>
+          <w:rFonts w:ascii="Aptos" w:hAnsi="Aptos"/>
+        </w:rPr>
+        <w:t>Our model projects that shallow cumulus clouds decrease with reduced large-scale overturning, but the moist updraft plumes of a mass flux model do not represent LCL clouds</w:t>
+      </w:r>
+      <w:r>
+        <w:rPr>
+          <w:rFonts w:ascii="Aptos" w:hAnsi="Aptos"/>
+        </w:rPr>
+        <w:t>,</w:t>
+      </w:r>
+      <w:r>
+        <w:rPr>
+          <w:rFonts w:ascii="Aptos" w:hAnsi="Aptos"/>
+        </w:rPr>
+        <w:t xml:space="preserve"> where</w:t>
+      </w:r>
+      <w:r>
+        <w:rPr>
+          <w:rFonts w:ascii="Aptos" w:hAnsi="Aptos"/>
+        </w:rPr>
+        <w:t xml:space="preserve"> </w:t>
+      </w:r>
+      <w:r>
+        <w:rPr>
+          <w:rFonts w:ascii="Aptos" w:hAnsi="Aptos"/>
+        </w:rPr>
+        <w:t>moisture condenses from turbulent subcloud thermals</w:t>
+      </w:r>
+      <w:r>
+        <w:rPr>
+          <w:rFonts w:ascii="Aptos" w:hAnsi="Aptos"/>
+        </w:rPr>
+        <w:t>.</w:t>
+      </w:r>
+      <w:r>
+        <w:rPr>
+          <w:rFonts w:ascii="Aptos" w:hAnsi="Aptos"/>
+        </w:rPr>
+        <w:t xml:space="preserve"> The net cloud radiative effect depends on the relative amount of shallow cumulus vs. LCL clouds. Vogel et al. (2022) found cloud-base cloud fraction to be 0.054 ± 0.031. We model LCL clouds formed by subcloud relative humidity fluctuations produced and dissipated by turbulence (Methods: LCL clouds). Cloud fraction is parameterized as the fraction of thermals exceeding saturation.</w:t>
+      </w:r>
+    </w:p>
+    <w:p>
+      <w:pPr>
+        <w:pStyle w:val="BodyText"/>
+        <w:rPr>
+          <w:rFonts w:ascii="Aptos" w:hAnsi="Aptos"/>
+        </w:rPr>
+      </w:pPr>
+      <w:r>
+        <w:rPr>
+          <w:rFonts w:ascii="Aptos" w:hAnsi="Aptos"/>
+        </w:rPr>
+        <w:lastRenderedPageBreak/>
+        <w:t>The change of LCL clouds depends on the effect of wind on the surface evaporation and to what degree cloud base humidity increases with surface humidity. The sign of the change of LCL clouds is uncertain. Assuming 1/3 of the clouds are LCL clouds that change by ±8% K</w:t>
+      </w:r>
+      <w:r>
+        <w:rPr>
+          <w:rFonts w:ascii="Aptos" w:hAnsi="Aptos"/>
+          <w:vertAlign w:val="superscript"/>
+        </w:rPr>
+        <w:t>–1</w:t>
+      </w:r>
+      <w:r>
+        <w:rPr>
+          <w:rFonts w:ascii="Aptos" w:hAnsi="Aptos"/>
+        </w:rPr>
+        <w:t>, and 2/3 are shallow cumulus that decrease –7.56 % K</w:t>
+      </w:r>
+      <w:r>
+        <w:rPr>
+          <w:rFonts w:ascii="Aptos" w:hAnsi="Aptos"/>
+          <w:vertAlign w:val="superscript"/>
+        </w:rPr>
+        <w:t>–1</w:t>
+      </w:r>
+      <w:r>
+        <w:rPr>
+          <w:rFonts w:ascii="Aptos" w:hAnsi="Aptos"/>
+        </w:rPr>
+        <w:t xml:space="preserve">, the total effect would be for clouds </w:t>
+      </w:r>
+      <w:r>
+        <w:rPr>
+          <w:rFonts w:ascii="Aptos" w:hAnsi="Aptos"/>
+        </w:rPr>
+        <w:t xml:space="preserve">below 4 km </w:t>
+      </w:r>
+      <w:r>
+        <w:rPr>
+          <w:rFonts w:ascii="Aptos" w:hAnsi="Aptos"/>
+        </w:rPr>
+        <w:t>to decrease with a range of  –7.7 to  –2.4 % K</w:t>
+      </w:r>
+      <w:r>
+        <w:rPr>
+          <w:rFonts w:ascii="Aptos" w:hAnsi="Aptos"/>
+          <w:vertAlign w:val="superscript"/>
+        </w:rPr>
+        <w:t>–1</w:t>
+      </w:r>
+      <w:r>
+        <w:rPr>
+          <w:rFonts w:ascii="Aptos" w:hAnsi="Aptos"/>
+        </w:rPr>
+        <w:t>.</w:t>
       </w:r>
     </w:p>
     <w:p>
@@ -7134,29 +7250,10 @@
         <w:spacing w:line="240" w:lineRule="auto"/>
         <w:rPr>
           <w:rFonts w:eastAsiaTheme="minorEastAsia"/>
-          <w:iCs/>
         </w:rPr>
       </w:pPr>
       <w:r>
-        <w:rPr>
-          <w:rFonts w:eastAsiaTheme="minorEastAsia"/>
-          <w:iCs/>
-        </w:rPr>
-        <w:t xml:space="preserve">Differences from </w:t>
-      </w:r>
-      <w:r>
-        <w:rPr>
-          <w:rFonts w:eastAsiaTheme="minorEastAsia"/>
-          <w:iCs/>
-        </w:rPr>
-        <w:t>the predictions of the DIM mechanism</w:t>
-      </w:r>
-      <w:r>
-        <w:rPr>
-          <w:rFonts w:eastAsiaTheme="minorEastAsia"/>
-          <w:iCs/>
-        </w:rPr>
-        <w:t xml:space="preserve"> in climate change simulations suggest variation in the response of the subsidence drying over the shallow cumulus region, or variations of the proportionalities of clouds or mass flux to the subsidence. A different relationship from </w:t>
+        <w:t xml:space="preserve">The hypotheses </w:t>
       </w:r>
       <m:oMath>
         <m:r>
@@ -7195,7 +7292,7 @@
               <w:rPr>
                 <w:rFonts w:ascii="Cambria Math" w:hAnsi="Cambria Math"/>
               </w:rPr>
-              <m:t>M</m:t>
+              <m:t>C</m:t>
             </m:r>
           </m:e>
         </m:func>
@@ -7235,6 +7332,46 @@
               <w:rPr>
                 <w:rFonts w:ascii="Cambria Math" w:hAnsi="Cambria Math"/>
               </w:rPr>
+              <m:t>M</m:t>
+            </m:r>
+          </m:e>
+        </m:func>
+        <m:r>
+          <w:rPr>
+            <w:rFonts w:ascii="Cambria Math" w:hAnsi="Cambria Math"/>
+          </w:rPr>
+          <m:t>=d</m:t>
+        </m:r>
+        <m:func>
+          <m:funcPr>
+            <m:ctrlPr>
+              <w:rPr>
+                <w:rFonts w:ascii="Cambria Math" w:hAnsi="Cambria Math"/>
+                <w:i/>
+              </w:rPr>
+            </m:ctrlPr>
+          </m:funcPr>
+          <m:fName>
+            <m:r>
+              <m:rPr>
+                <m:sty m:val="p"/>
+              </m:rPr>
+              <w:rPr>
+                <w:rFonts w:ascii="Cambria Math" w:hAnsi="Cambria Math"/>
+              </w:rPr>
+              <m:t>ln</m:t>
+            </m:r>
+            <m:ctrlPr>
+              <w:rPr>
+                <w:rFonts w:ascii="Cambria Math" w:hAnsi="Cambria Math"/>
+              </w:rPr>
+            </m:ctrlPr>
+          </m:fName>
+          <m:e>
+            <m:r>
+              <w:rPr>
+                <w:rFonts w:ascii="Cambria Math" w:hAnsi="Cambria Math"/>
+              </w:rPr>
               <m:t>W</m:t>
             </m:r>
           </m:e>
@@ -7244,13 +7381,281 @@
         <w:rPr>
           <w:rFonts w:eastAsiaTheme="minorEastAsia"/>
         </w:rPr>
+        <w:t xml:space="preserve"> depend on cloud-scale and smaller processes, which are parameterized in climate models. Cloud parameterizations used in these models must satisfy many global </w:t>
+      </w:r>
+      <w:proofErr w:type="gramStart"/>
+      <w:r>
+        <w:rPr>
+          <w:rFonts w:eastAsiaTheme="minorEastAsia"/>
+        </w:rPr>
+        <w:t>constraints, but</w:t>
+      </w:r>
+      <w:proofErr w:type="gramEnd"/>
+      <w:r>
+        <w:rPr>
+          <w:rFonts w:eastAsiaTheme="minorEastAsia"/>
+        </w:rPr>
+        <w:t xml:space="preserve"> might not be suited to faithfully simulate the moisture flux and cloud fraction of shallow cumulus clouds</w:t>
+      </w:r>
+      <w:r>
+        <w:rPr>
+          <w:rFonts w:eastAsiaTheme="minorEastAsia"/>
+        </w:rPr>
         <w:t xml:space="preserve"> </w:t>
       </w:r>
       <w:r>
         <w:rPr>
           <w:rFonts w:eastAsiaTheme="minorEastAsia"/>
+        </w:rPr>
+        <w:t>(</w:t>
+      </w:r>
+      <w:r>
+        <w:rPr>
+          <w:rFonts w:eastAsiaTheme="minorEastAsia"/>
+        </w:rPr>
+        <w:t>Vial et al.</w:t>
+      </w:r>
+      <w:r>
+        <w:rPr>
+          <w:rFonts w:eastAsiaTheme="minorEastAsia"/>
+        </w:rPr>
+        <w:t>,</w:t>
+      </w:r>
+      <w:r>
+        <w:rPr>
+          <w:rFonts w:eastAsiaTheme="minorEastAsia"/>
+        </w:rPr>
+        <w:t xml:space="preserve"> </w:t>
+      </w:r>
+      <w:r>
+        <w:rPr>
+          <w:rFonts w:eastAsiaTheme="minorEastAsia"/>
+        </w:rPr>
+        <w:t>2017</w:t>
+      </w:r>
+      <w:r>
+        <w:rPr>
+          <w:rFonts w:eastAsiaTheme="minorEastAsia"/>
+        </w:rPr>
+        <w:t xml:space="preserve">, </w:t>
+      </w:r>
+      <w:r>
+        <w:rPr>
+          <w:rFonts w:eastAsiaTheme="minorEastAsia"/>
+        </w:rPr>
+        <w:t>Nuijens</w:t>
+      </w:r>
+      <w:r>
+        <w:rPr>
+          <w:rFonts w:eastAsiaTheme="minorEastAsia"/>
+        </w:rPr>
+        <w:t xml:space="preserve"> et al</w:t>
+      </w:r>
+      <w:r>
+        <w:rPr>
+          <w:rFonts w:eastAsiaTheme="minorEastAsia"/>
+        </w:rPr>
+        <w:t>., 2015)</w:t>
+      </w:r>
+      <w:r>
+        <w:rPr>
+          <w:rFonts w:eastAsiaTheme="minorEastAsia"/>
+        </w:rPr>
+        <w:t>.</w:t>
+      </w:r>
+      <w:r>
+        <w:rPr>
+          <w:rFonts w:eastAsiaTheme="minorEastAsia"/>
           <w:iCs/>
         </w:rPr>
+        <w:t xml:space="preserve"> </w:t>
+      </w:r>
+      <w:r>
+        <w:rPr>
+          <w:rFonts w:eastAsiaTheme="minorEastAsia"/>
+          <w:iCs/>
+        </w:rPr>
+        <w:t xml:space="preserve">In our heuristic shallow cumulus model, cloud-scale turbulent processes are represented by lateral entrainment into clouds. Each entrainment rate determines a profile of a cloud’s moisture </w:t>
+      </w:r>
+      <m:oMath>
+        <m:sSub>
+          <m:sSubPr>
+            <m:ctrlPr>
+              <w:rPr>
+                <w:rFonts w:ascii="Cambria Math" w:eastAsiaTheme="minorEastAsia" w:hAnsi="Cambria Math"/>
+                <w:i/>
+                <w:iCs/>
+              </w:rPr>
+            </m:ctrlPr>
+          </m:sSubPr>
+          <m:e>
+            <m:r>
+              <w:rPr>
+                <w:rFonts w:ascii="Cambria Math" w:eastAsiaTheme="minorEastAsia" w:hAnsi="Cambria Math"/>
+              </w:rPr>
+              <m:t>q</m:t>
+            </m:r>
+            <m:ctrlPr>
+              <w:rPr>
+                <w:rFonts w:ascii="Cambria Math" w:eastAsiaTheme="minorEastAsia" w:hAnsi="Cambria Math"/>
+                <w:i/>
+              </w:rPr>
+            </m:ctrlPr>
+          </m:e>
+          <m:sub>
+            <m:r>
+              <w:rPr>
+                <w:rFonts w:ascii="Cambria Math" w:eastAsiaTheme="minorEastAsia" w:hAnsi="Cambria Math"/>
+              </w:rPr>
+              <m:t>c</m:t>
+            </m:r>
+          </m:sub>
+        </m:sSub>
+      </m:oMath>
+      <w:r>
+        <w:rPr>
+          <w:rFonts w:eastAsiaTheme="minorEastAsia"/>
+          <w:iCs/>
+        </w:rPr>
+        <w:t xml:space="preserve"> and determines its cloud top height. We find a spectrum of entrainment rates that give the observed shallow cumulus cloud top height distribution and moisture flux divergence in the present climate. This entrainment distribution represents cloud-scale processes like cloud parameterizations determined from observations and/or large-eddy simulations. The entrainment distribution approximately reproduces the proportionality of cloud </w:t>
+      </w:r>
+      <w:r>
+        <w:rPr>
+          <w:rFonts w:eastAsiaTheme="minorEastAsia"/>
+          <w:iCs/>
+        </w:rPr>
+        <w:t>albedo</w:t>
+      </w:r>
+      <w:r>
+        <w:rPr>
+          <w:rFonts w:eastAsiaTheme="minorEastAsia"/>
+          <w:iCs/>
+        </w:rPr>
+        <w:t xml:space="preserve"> to mass flux </w:t>
+      </w:r>
+      <m:oMath>
+        <m:r>
+          <w:rPr>
+            <w:rFonts w:ascii="Cambria Math" w:eastAsiaTheme="minorEastAsia" w:hAnsi="Cambria Math"/>
+          </w:rPr>
+          <m:t>A∝M</m:t>
+        </m:r>
+      </m:oMath>
+      <w:r>
+        <w:rPr>
+          <w:rFonts w:eastAsiaTheme="minorEastAsia"/>
+        </w:rPr>
+        <w:t>.</w:t>
+      </w:r>
+    </w:p>
+    <w:p>
+      <w:pPr>
+        <w:spacing w:line="240" w:lineRule="auto"/>
+        <w:rPr>
+          <w:rFonts w:eastAsiaTheme="minorEastAsia"/>
+          <w:iCs/>
+        </w:rPr>
+      </w:pPr>
+      <w:r>
+        <w:rPr>
+          <w:rFonts w:eastAsiaTheme="minorEastAsia"/>
+          <w:iCs/>
+        </w:rPr>
+        <w:t xml:space="preserve">Differences from the predictions of the DIM mechanism in climate change simulations suggest variation in the response of the subsidence drying over the shallow cumulus region, or variations of the proportionalities of clouds or mass flux to the subsidence. A different relationship from </w:t>
+      </w:r>
+      <m:oMath>
+        <m:r>
+          <w:rPr>
+            <w:rFonts w:ascii="Cambria Math" w:hAnsi="Cambria Math"/>
+          </w:rPr>
+          <m:t>d</m:t>
+        </m:r>
+        <m:func>
+          <m:funcPr>
+            <m:ctrlPr>
+              <w:rPr>
+                <w:rFonts w:ascii="Cambria Math" w:hAnsi="Cambria Math"/>
+                <w:i/>
+              </w:rPr>
+            </m:ctrlPr>
+          </m:funcPr>
+          <m:fName>
+            <m:r>
+              <m:rPr>
+                <m:sty m:val="p"/>
+              </m:rPr>
+              <w:rPr>
+                <w:rFonts w:ascii="Cambria Math" w:hAnsi="Cambria Math"/>
+              </w:rPr>
+              <m:t>ln</m:t>
+            </m:r>
+            <m:ctrlPr>
+              <w:rPr>
+                <w:rFonts w:ascii="Cambria Math" w:hAnsi="Cambria Math"/>
+              </w:rPr>
+            </m:ctrlPr>
+          </m:fName>
+          <m:e>
+            <m:r>
+              <w:rPr>
+                <w:rFonts w:ascii="Cambria Math" w:hAnsi="Cambria Math"/>
+              </w:rPr>
+              <m:t>M</m:t>
+            </m:r>
+          </m:e>
+        </m:func>
+        <m:r>
+          <w:rPr>
+            <w:rFonts w:ascii="Cambria Math" w:hAnsi="Cambria Math"/>
+          </w:rPr>
+          <m:t>=d</m:t>
+        </m:r>
+        <m:func>
+          <m:funcPr>
+            <m:ctrlPr>
+              <w:rPr>
+                <w:rFonts w:ascii="Cambria Math" w:hAnsi="Cambria Math"/>
+                <w:i/>
+              </w:rPr>
+            </m:ctrlPr>
+          </m:funcPr>
+          <m:fName>
+            <m:r>
+              <m:rPr>
+                <m:sty m:val="p"/>
+              </m:rPr>
+              <w:rPr>
+                <w:rFonts w:ascii="Cambria Math" w:hAnsi="Cambria Math"/>
+              </w:rPr>
+              <m:t>ln</m:t>
+            </m:r>
+            <m:ctrlPr>
+              <w:rPr>
+                <w:rFonts w:ascii="Cambria Math" w:hAnsi="Cambria Math"/>
+              </w:rPr>
+            </m:ctrlPr>
+          </m:fName>
+          <m:e>
+            <m:r>
+              <w:rPr>
+                <w:rFonts w:ascii="Cambria Math" w:hAnsi="Cambria Math"/>
+              </w:rPr>
+              <m:t>W</m:t>
+            </m:r>
+          </m:e>
+        </m:func>
+      </m:oMath>
+      <w:r>
+        <w:rPr>
+          <w:rFonts w:eastAsiaTheme="minorEastAsia"/>
+        </w:rPr>
+        <w:t xml:space="preserve"> </w:t>
+      </w:r>
+      <w:r>
+        <w:rPr>
+          <w:rFonts w:eastAsiaTheme="minorEastAsia"/>
+          <w:iCs/>
+        </w:rPr>
         <w:t xml:space="preserve">is possible if either the entrainment or the vertical structure of convective moisture flux changes. </w:t>
       </w:r>
       <w:r>
@@ -7271,34 +7676,14 @@
         <w:rPr>
           <w:rFonts w:eastAsiaTheme="minorEastAsia"/>
         </w:rPr>
-        <w:t xml:space="preserve"> does not account for secondary desiccation of optically thick stratocumulus clouds</w:t>
-      </w:r>
-      <w:r>
-        <w:rPr>
-          <w:rFonts w:eastAsiaTheme="minorEastAsia"/>
-        </w:rPr>
-        <w:t xml:space="preserve">, found near </w:t>
-      </w:r>
-      <w:r>
-        <w:rPr>
-          <w:rFonts w:eastAsiaTheme="minorEastAsia"/>
-        </w:rPr>
-        <w:t xml:space="preserve">cloud base in most climate models. </w:t>
+        <w:t xml:space="preserve"> does not account for secondary desiccation of optically thick stratocumulus clouds, found near cloud base in most climate models. </w:t>
       </w:r>
       <w:r>
         <w:rPr>
           <w:rFonts w:eastAsiaTheme="minorEastAsia"/>
           <w:iCs/>
         </w:rPr>
-        <w:t xml:space="preserve">Divergence of the vertically developed shallow cumulus cloud </w:t>
-      </w:r>
-      <w:r>
-        <w:rPr>
-          <w:rFonts w:eastAsiaTheme="minorEastAsia"/>
-          <w:iCs/>
-        </w:rPr>
-        <w:lastRenderedPageBreak/>
-        <w:t xml:space="preserve">fraction from </w:t>
+        <w:t xml:space="preserve">Divergence of the vertically developed shallow cumulus cloud fraction from </w:t>
       </w:r>
       <m:oMath>
         <m:r>
@@ -7538,19 +7923,7 @@
         <w:rPr>
           <w:rFonts w:eastAsiaTheme="minorEastAsia"/>
         </w:rPr>
-        <w:t xml:space="preserve"> changes for clouds in a different climate. [</w:t>
-      </w:r>
-      <w:r>
-        <w:rPr>
-          <w:rFonts w:eastAsiaTheme="minorEastAsia"/>
-        </w:rPr>
-        <w:t xml:space="preserve">Ref in </w:t>
-      </w:r>
-      <w:r>
-        <w:rPr>
-          <w:rFonts w:eastAsiaTheme="minorEastAsia"/>
-        </w:rPr>
-        <w:t xml:space="preserve">Vogel says </w:t>
+        <w:t xml:space="preserve"> changes for clouds in a different climate. [Ref in Vogel says </w:t>
       </w:r>
       <m:oMath>
         <m:f>
@@ -7616,305 +7989,6 @@
     </w:p>
     <w:p>
       <w:pPr>
-        <w:spacing w:line="240" w:lineRule="auto"/>
-        <w:rPr>
-          <w:rFonts w:eastAsiaTheme="minorEastAsia"/>
-          <w:iCs/>
-        </w:rPr>
-      </w:pPr>
-      <w:r>
-        <w:t xml:space="preserve">The hypotheses </w:t>
-      </w:r>
-      <m:oMath>
-        <m:r>
-          <w:rPr>
-            <w:rFonts w:ascii="Cambria Math" w:hAnsi="Cambria Math"/>
-          </w:rPr>
-          <m:t>d</m:t>
-        </m:r>
-        <m:func>
-          <m:funcPr>
-            <m:ctrlPr>
-              <w:rPr>
-                <w:rFonts w:ascii="Cambria Math" w:hAnsi="Cambria Math"/>
-                <w:i/>
-              </w:rPr>
-            </m:ctrlPr>
-          </m:funcPr>
-          <m:fName>
-            <m:r>
-              <m:rPr>
-                <m:sty m:val="p"/>
-              </m:rPr>
-              <w:rPr>
-                <w:rFonts w:ascii="Cambria Math" w:hAnsi="Cambria Math"/>
-              </w:rPr>
-              <m:t>ln</m:t>
-            </m:r>
-            <m:ctrlPr>
-              <w:rPr>
-                <w:rFonts w:ascii="Cambria Math" w:hAnsi="Cambria Math"/>
-              </w:rPr>
-            </m:ctrlPr>
-          </m:fName>
-          <m:e>
-            <m:r>
-              <w:rPr>
-                <w:rFonts w:ascii="Cambria Math" w:hAnsi="Cambria Math"/>
-              </w:rPr>
-              <m:t>C</m:t>
-            </m:r>
-          </m:e>
-        </m:func>
-        <m:r>
-          <w:rPr>
-            <w:rFonts w:ascii="Cambria Math" w:hAnsi="Cambria Math"/>
-          </w:rPr>
-          <m:t>=d</m:t>
-        </m:r>
-        <m:func>
-          <m:funcPr>
-            <m:ctrlPr>
-              <w:rPr>
-                <w:rFonts w:ascii="Cambria Math" w:hAnsi="Cambria Math"/>
-                <w:i/>
-              </w:rPr>
-            </m:ctrlPr>
-          </m:funcPr>
-          <m:fName>
-            <m:r>
-              <m:rPr>
-                <m:sty m:val="p"/>
-              </m:rPr>
-              <w:rPr>
-                <w:rFonts w:ascii="Cambria Math" w:hAnsi="Cambria Math"/>
-              </w:rPr>
-              <m:t>ln</m:t>
-            </m:r>
-            <m:ctrlPr>
-              <w:rPr>
-                <w:rFonts w:ascii="Cambria Math" w:hAnsi="Cambria Math"/>
-              </w:rPr>
-            </m:ctrlPr>
-          </m:fName>
-          <m:e>
-            <m:r>
-              <w:rPr>
-                <w:rFonts w:ascii="Cambria Math" w:hAnsi="Cambria Math"/>
-              </w:rPr>
-              <m:t>M</m:t>
-            </m:r>
-          </m:e>
-        </m:func>
-        <m:r>
-          <w:rPr>
-            <w:rFonts w:ascii="Cambria Math" w:hAnsi="Cambria Math"/>
-          </w:rPr>
-          <m:t>=d</m:t>
-        </m:r>
-        <m:func>
-          <m:funcPr>
-            <m:ctrlPr>
-              <w:rPr>
-                <w:rFonts w:ascii="Cambria Math" w:hAnsi="Cambria Math"/>
-                <w:i/>
-              </w:rPr>
-            </m:ctrlPr>
-          </m:funcPr>
-          <m:fName>
-            <m:r>
-              <m:rPr>
-                <m:sty m:val="p"/>
-              </m:rPr>
-              <w:rPr>
-                <w:rFonts w:ascii="Cambria Math" w:hAnsi="Cambria Math"/>
-              </w:rPr>
-              <m:t>ln</m:t>
-            </m:r>
-            <m:ctrlPr>
-              <w:rPr>
-                <w:rFonts w:ascii="Cambria Math" w:hAnsi="Cambria Math"/>
-              </w:rPr>
-            </m:ctrlPr>
-          </m:fName>
-          <m:e>
-            <m:r>
-              <w:rPr>
-                <w:rFonts w:ascii="Cambria Math" w:hAnsi="Cambria Math"/>
-              </w:rPr>
-              <m:t>W</m:t>
-            </m:r>
-          </m:e>
-        </m:func>
-      </m:oMath>
-      <w:r>
-        <w:rPr>
-          <w:rFonts w:eastAsiaTheme="minorEastAsia"/>
-        </w:rPr>
-        <w:t xml:space="preserve"> depend on cloud-scale and smaller processes, which are parameterized in climate models. Cloud parameterizations used in these models must satisfy many global </w:t>
-      </w:r>
-      <w:proofErr w:type="gramStart"/>
-      <w:r>
-        <w:rPr>
-          <w:rFonts w:eastAsiaTheme="minorEastAsia"/>
-        </w:rPr>
-        <w:t>constraints, but</w:t>
-      </w:r>
-      <w:proofErr w:type="gramEnd"/>
-      <w:r>
-        <w:rPr>
-          <w:rFonts w:eastAsiaTheme="minorEastAsia"/>
-        </w:rPr>
-        <w:t xml:space="preserve"> might not be suited to faithfully simulate the moisture flux and cloud fraction of shallow cumulus clouds.</w:t>
-      </w:r>
-      <w:r>
-        <w:rPr>
-          <w:rFonts w:eastAsiaTheme="minorEastAsia"/>
-        </w:rPr>
-        <w:t xml:space="preserve"> </w:t>
-      </w:r>
-      <w:r>
-        <w:rPr>
-          <w:rFonts w:eastAsiaTheme="minorEastAsia"/>
-        </w:rPr>
-        <w:t>(</w:t>
-      </w:r>
-      <w:r>
-        <w:rPr>
-          <w:rFonts w:eastAsiaTheme="minorEastAsia"/>
-        </w:rPr>
-        <w:t>Vial et al.</w:t>
-      </w:r>
-      <w:r>
-        <w:rPr>
-          <w:rFonts w:eastAsiaTheme="minorEastAsia"/>
-        </w:rPr>
-        <w:t>,</w:t>
-      </w:r>
-      <w:r>
-        <w:rPr>
-          <w:rFonts w:eastAsiaTheme="minorEastAsia"/>
-        </w:rPr>
-        <w:t xml:space="preserve"> </w:t>
-      </w:r>
-      <w:r>
-        <w:rPr>
-          <w:rFonts w:eastAsiaTheme="minorEastAsia"/>
-        </w:rPr>
-        <w:t>2017</w:t>
-      </w:r>
-      <w:r>
-        <w:rPr>
-          <w:rFonts w:eastAsiaTheme="minorEastAsia"/>
-        </w:rPr>
-        <w:t xml:space="preserve">, </w:t>
-      </w:r>
-      <w:r>
-        <w:rPr>
-          <w:rFonts w:eastAsiaTheme="minorEastAsia"/>
-        </w:rPr>
-        <w:t>Nuijens</w:t>
-      </w:r>
-      <w:r>
-        <w:rPr>
-          <w:rFonts w:eastAsiaTheme="minorEastAsia"/>
-        </w:rPr>
-        <w:t xml:space="preserve"> et al</w:t>
-      </w:r>
-      <w:r>
-        <w:rPr>
-          <w:rFonts w:eastAsiaTheme="minorEastAsia"/>
-        </w:rPr>
-        <w:t>., 2015)</w:t>
-      </w:r>
-    </w:p>
-    <w:p>
-      <w:pPr>
-        <w:spacing w:line="240" w:lineRule="auto"/>
-        <w:rPr>
-          <w:rFonts w:eastAsiaTheme="minorEastAsia"/>
-        </w:rPr>
-      </w:pPr>
-      <w:r>
-        <w:rPr>
-          <w:rFonts w:eastAsiaTheme="minorEastAsia"/>
-          <w:iCs/>
-        </w:rPr>
-        <w:t xml:space="preserve">In our heuristic shallow cumulus model, cloud-scale turbulent processes are represented by lateral entrainment into clouds. Each entrainment rate determines a profile of a cloud’s moisture </w:t>
-      </w:r>
-      <m:oMath>
-        <m:sSub>
-          <m:sSubPr>
-            <m:ctrlPr>
-              <w:rPr>
-                <w:rFonts w:ascii="Cambria Math" w:eastAsiaTheme="minorEastAsia" w:hAnsi="Cambria Math"/>
-                <w:i/>
-                <w:iCs/>
-              </w:rPr>
-            </m:ctrlPr>
-          </m:sSubPr>
-          <m:e>
-            <m:r>
-              <w:rPr>
-                <w:rFonts w:ascii="Cambria Math" w:eastAsiaTheme="minorEastAsia" w:hAnsi="Cambria Math"/>
-              </w:rPr>
-              <m:t>q</m:t>
-            </m:r>
-            <m:ctrlPr>
-              <w:rPr>
-                <w:rFonts w:ascii="Cambria Math" w:eastAsiaTheme="minorEastAsia" w:hAnsi="Cambria Math"/>
-                <w:i/>
-              </w:rPr>
-            </m:ctrlPr>
-          </m:e>
-          <m:sub>
-            <m:r>
-              <w:rPr>
-                <w:rFonts w:ascii="Cambria Math" w:eastAsiaTheme="minorEastAsia" w:hAnsi="Cambria Math"/>
-              </w:rPr>
-              <m:t>c</m:t>
-            </m:r>
-          </m:sub>
-        </m:sSub>
-      </m:oMath>
-      <w:r>
-        <w:rPr>
-          <w:rFonts w:eastAsiaTheme="minorEastAsia"/>
-          <w:iCs/>
-        </w:rPr>
-        <w:t xml:space="preserve"> and determines its cloud top height. We find a spectrum of entrainment rates that give the observed shallow cumulus cloud top height distribution and moisture flux divergence in the present climate. This entrainment distribution represents cloud-scale processes like cloud parameterizations determined from observations and/or large-eddy simulations. The entrainment distribution approximately reproduces the proportionality of cloud </w:t>
-      </w:r>
-      <w:r>
-        <w:rPr>
-          <w:rFonts w:eastAsiaTheme="minorEastAsia"/>
-          <w:iCs/>
-        </w:rPr>
-        <w:t>albedo</w:t>
-      </w:r>
-      <w:r>
-        <w:rPr>
-          <w:rFonts w:eastAsiaTheme="minorEastAsia"/>
-          <w:iCs/>
-        </w:rPr>
-        <w:t xml:space="preserve"> to mass flux </w:t>
-      </w:r>
-      <m:oMath>
-        <m:r>
-          <w:rPr>
-            <w:rFonts w:ascii="Cambria Math" w:eastAsiaTheme="minorEastAsia" w:hAnsi="Cambria Math"/>
-          </w:rPr>
-          <m:t>A∝M</m:t>
-        </m:r>
-      </m:oMath>
-      <w:r>
-        <w:rPr>
-          <w:rFonts w:eastAsiaTheme="minorEastAsia"/>
-        </w:rPr>
-        <w:t>.</w:t>
-      </w:r>
-    </w:p>
-    <w:p>
-      <w:pPr>
         <w:pStyle w:val="Heading1"/>
       </w:pPr>
       <w:r>
@@ -8157,7 +8231,11 @@
       </w:r>
       <w:proofErr w:type="spellEnd"/>
       <w:r>
-        <w:t xml:space="preserve"> et al., 2021; Zelinka et al. 2025), so shifts from stratocumulus to shallow cumulus could result in partial compensation between their radiative effects. The mixing-induced low cloud feedback describes a version of this competition in the global average, whereby mixing by precipitating convection dries lower levels and evaporates extensive and optically thick stratocumulus clouds. All else equal, subsidence </w:t>
+        <w:t xml:space="preserve"> et al., 2021; Zelinka et al. 2025), so shifts from stratocumulus to shallow cumulus could result in partial compensation </w:t>
+      </w:r>
+      <w:r>
+        <w:lastRenderedPageBreak/>
+        <w:t xml:space="preserve">between their radiative effects. The mixing-induced low cloud feedback describes a version of this competition in the global average, whereby mixing by precipitating convection dries lower levels and evaporates extensive and optically thick stratocumulus clouds. All else equal, subsidence </w:t>
       </w:r>
       <w:r>
         <w:t xml:space="preserve">is found to </w:t>
@@ -8204,10 +8282,13 @@
         <w:t>While the mass flux model’s</w:t>
       </w:r>
       <w:r>
-        <w:t xml:space="preserve"> lowest clouds increase with RH, we caution against extrapolating the mass flux model to </w:t>
-      </w:r>
-      <w:r>
-        <w:t xml:space="preserve">extensive </w:t>
+        <w:t xml:space="preserve"> lowest clouds increase with RH, </w:t>
+      </w:r>
+      <w:r>
+        <w:t>it is not suitable for modeling</w:t>
+      </w:r>
+      <w:r>
+        <w:t xml:space="preserve"> </w:t>
       </w:r>
       <w:r>
         <w:t>stratocumulus clouds</w:t>
@@ -8242,31 +8323,34 @@
         <w:t xml:space="preserve"> of vertical gradients and diffusive turbulent eddies. </w:t>
       </w:r>
       <w:r>
-        <w:t>A</w:t>
-      </w:r>
-      <w:r>
-        <w:t xml:space="preserve">n alternative model for cloud fraction changes related to humidity and fluxes in the </w:t>
-      </w:r>
-      <w:r>
-        <w:lastRenderedPageBreak/>
-        <w:t>turbulent subcloud layer</w:t>
-      </w:r>
-      <w:r>
-        <w:t xml:space="preserve"> (Supplement LCL Clouds) demonstrates that weak changes in </w:t>
-      </w:r>
-      <w:proofErr w:type="gramStart"/>
-      <w:r>
-        <w:t xml:space="preserve">humidity </w:t>
-      </w:r>
-      <w:r>
-        <w:t>.</w:t>
-      </w:r>
-      <w:proofErr w:type="gramEnd"/>
-      <w:r>
-        <w:t xml:space="preserve"> E</w:t>
-      </w:r>
-      <w:r>
-        <w:t>ddy diffusivity and mass flux schemes are needed to simulate interactions of shallow cumulus and stratocumulus clouds in climate models.</w:t>
+        <w:t xml:space="preserve">A </w:t>
+      </w:r>
+      <w:r>
+        <w:t>model</w:t>
+      </w:r>
+      <w:r>
+        <w:t xml:space="preserve"> for subcloud </w:t>
+      </w:r>
+      <w:r>
+        <w:t xml:space="preserve">turbulent </w:t>
+      </w:r>
+      <w:r>
+        <w:t>humidity fluctuations</w:t>
+      </w:r>
+      <w:r>
+        <w:t xml:space="preserve"> </w:t>
+      </w:r>
+      <w:r>
+        <w:t>shows</w:t>
+      </w:r>
+      <w:r>
+        <w:t xml:space="preserve"> </w:t>
+      </w:r>
+      <w:r>
+        <w:t xml:space="preserve">LCL clouds may increase or decrease, depending subtle changes in </w:t>
+      </w:r>
+      <w:r>
+        <w:t>subcloud moisture flux and cloud base relative humidity.</w:t>
       </w:r>
     </w:p>
     <w:p>
@@ -9102,7 +9186,14 @@
         <w:rPr>
           <w:rFonts w:ascii="Aptos" w:hAnsi="Aptos"/>
         </w:rPr>
-        <w:t xml:space="preserve"> FBCT radiative fluxes in each bin minus clear-sky radiative flux (Fig. GOESISCCP d). CRE changes </w:t>
+        <w:t xml:space="preserve"> FBCT radiative fluxes in each bin minus </w:t>
+      </w:r>
+      <w:r>
+        <w:rPr>
+          <w:rFonts w:ascii="Aptos" w:hAnsi="Aptos"/>
+        </w:rPr>
+        <w:lastRenderedPageBreak/>
+        <w:t xml:space="preserve">clear-sky radiative flux (Fig. GOESISCCP d). CRE changes </w:t>
       </w:r>
       <w:r>
         <w:rPr>
@@ -9546,7 +9637,6 @@
           <w:kern w:val="0"/>
           <w14:ligatures w14:val="none"/>
         </w:rPr>
-        <w:lastRenderedPageBreak/>
         <w:t xml:space="preserve">The </w:t>
       </w:r>
       <w:r>
@@ -19062,31 +19152,37 @@
         <w:rPr>
           <w:rFonts w:ascii="Aptos" w:hAnsi="Aptos"/>
         </w:rPr>
-        <w:t>Our model projects that shallow cumulus clouds decrease with reduced large-scale overturning</w:t>
-      </w:r>
-      <w:r>
-        <w:rPr>
-          <w:rFonts w:ascii="Aptos" w:hAnsi="Aptos"/>
-        </w:rPr>
-        <w:t>, but t</w:t>
-      </w:r>
-      <w:r>
-        <w:rPr>
-          <w:rFonts w:ascii="Aptos" w:hAnsi="Aptos"/>
-        </w:rPr>
-        <w:t>he moist updraft plumes of a mass flux model</w:t>
-      </w:r>
-      <w:r>
-        <w:rPr>
-          <w:rFonts w:ascii="Aptos" w:hAnsi="Aptos"/>
-        </w:rPr>
-        <w:t xml:space="preserve"> do not represent </w:t>
-      </w:r>
-      <w:r>
-        <w:rPr>
-          <w:rFonts w:ascii="Aptos" w:hAnsi="Aptos"/>
-        </w:rPr>
-        <w:t>LCL clouds</w:t>
+        <w:t xml:space="preserve">Large-eddy simulation (LES; </w:t>
+      </w:r>
+      <w:r>
+        <w:rPr>
+          <w:rFonts w:ascii="Aptos" w:hAnsi="Aptos"/>
+        </w:rPr>
+        <w:t>(Bretherton et al. </w:t>
+      </w:r>
+      <w:r>
+        <w:rPr>
+          <w:rFonts w:ascii="Aptos" w:hAnsi="Aptos"/>
+        </w:rPr>
+        <w:t>2013</w:t>
+      </w:r>
+      <w:r>
+        <w:rPr>
+          <w:rFonts w:ascii="Aptos" w:hAnsi="Aptos"/>
+        </w:rPr>
+        <w:t>, Blossey et al. </w:t>
+      </w:r>
+      <w:r>
+        <w:rPr>
+          <w:rFonts w:ascii="Aptos" w:hAnsi="Aptos"/>
+        </w:rPr>
+        <w:t xml:space="preserve">2013) and observations (Bony et al., 2021; </w:t>
+      </w:r>
+      <w:r>
+        <w:rPr>
+          <w:rFonts w:ascii="Aptos" w:hAnsi="Aptos"/>
+        </w:rPr>
+        <w:t>Vogel et al.</w:t>
       </w:r>
       <w:r>
         <w:rPr>
@@ -19098,8 +19194,100 @@
         <w:rPr>
           <w:rFonts w:ascii="Aptos" w:hAnsi="Aptos"/>
         </w:rPr>
-        <w:t xml:space="preserve"> where</w:t>
-      </w:r>
+        <w:t> 2022</w:t>
+      </w:r>
+      <w:r>
+        <w:rPr>
+          <w:rFonts w:ascii="Aptos" w:hAnsi="Aptos"/>
+        </w:rPr>
+        <w:t>; Fig. REFLALBEDO</w:t>
+      </w:r>
+      <w:r>
+        <w:rPr>
+          <w:rFonts w:ascii="Aptos" w:hAnsi="Aptos"/>
+        </w:rPr>
+        <w:t>)</w:t>
+      </w:r>
+      <w:r>
+        <w:rPr>
+          <w:rFonts w:ascii="Aptos" w:hAnsi="Aptos"/>
+        </w:rPr>
+        <w:t xml:space="preserve"> have a</w:t>
+      </w:r>
+      <w:r>
+        <w:rPr>
+          <w:rFonts w:ascii="Aptos" w:hAnsi="Aptos"/>
+        </w:rPr>
+        <w:t xml:space="preserve"> cloud fraction </w:t>
+      </w:r>
+      <w:r>
+        <w:rPr>
+          <w:rFonts w:ascii="Aptos" w:hAnsi="Aptos"/>
+        </w:rPr>
+        <w:t xml:space="preserve">maximum of </w:t>
+      </w:r>
+      <w:r>
+        <w:rPr>
+          <w:rFonts w:ascii="Aptos" w:hAnsi="Aptos"/>
+        </w:rPr>
+        <w:t xml:space="preserve">about 5 % </w:t>
+      </w:r>
+      <w:r>
+        <w:rPr>
+          <w:rFonts w:ascii="Aptos" w:hAnsi="Aptos"/>
+        </w:rPr>
+        <w:t>near the</w:t>
+      </w:r>
+      <w:r>
+        <w:rPr>
+          <w:rFonts w:ascii="Aptos" w:hAnsi="Aptos"/>
+        </w:rPr>
+        <w:t xml:space="preserve"> cloud base</w:t>
+      </w:r>
+      <w:r>
+        <w:rPr>
+          <w:rFonts w:ascii="Aptos" w:hAnsi="Aptos"/>
+        </w:rPr>
+        <w:t>.</w:t>
+      </w:r>
+      <w:r>
+        <w:rPr>
+          <w:rFonts w:ascii="Aptos" w:hAnsi="Aptos"/>
+        </w:rPr>
+        <w:t xml:space="preserve"> We s</w:t>
+      </w:r>
+      <w:r>
+        <w:rPr>
+          <w:rFonts w:ascii="Aptos" w:hAnsi="Aptos"/>
+        </w:rPr>
+        <w:t>cale th</w:t>
+      </w:r>
+      <w:r>
+        <w:rPr>
+          <w:rFonts w:ascii="Aptos" w:hAnsi="Aptos"/>
+        </w:rPr>
+        <w:t>is</w:t>
+      </w:r>
+      <w:r>
+        <w:rPr>
+          <w:rFonts w:ascii="Aptos" w:hAnsi="Aptos"/>
+        </w:rPr>
+        <w:t xml:space="preserve"> LCL cloud fraction from the subcloud relative humidity and moisture </w:t>
+      </w:r>
+      <w:proofErr w:type="gramStart"/>
+      <w:r>
+        <w:rPr>
+          <w:rFonts w:ascii="Aptos" w:hAnsi="Aptos"/>
+        </w:rPr>
+        <w:t>fluxes</w:t>
+      </w:r>
+      <w:r>
+        <w:rPr>
+          <w:rFonts w:ascii="Aptos" w:hAnsi="Aptos"/>
+        </w:rPr>
+        <w:t>, and</w:t>
+      </w:r>
+      <w:proofErr w:type="gramEnd"/>
       <w:r>
         <w:rPr>
           <w:rFonts w:ascii="Aptos" w:hAnsi="Aptos"/>
@@ -19110,13 +19298,13 @@
         <w:rPr>
           <w:rFonts w:ascii="Aptos" w:hAnsi="Aptos"/>
         </w:rPr>
-        <w:t>moisture condenses from turbulent subcloud thermals</w:t>
-      </w:r>
-      <w:r>
-        <w:rPr>
-          <w:rFonts w:ascii="Aptos" w:hAnsi="Aptos"/>
-        </w:rPr>
-        <w:t>.</w:t>
+        <w:t xml:space="preserve">test the sensitivity </w:t>
+      </w:r>
+      <w:r>
+        <w:rPr>
+          <w:rFonts w:ascii="Aptos" w:hAnsi="Aptos"/>
+        </w:rPr>
+        <w:t>of</w:t>
       </w:r>
       <w:r>
         <w:rPr>
@@ -19128,56 +19316,33 @@
         <w:rPr>
           <w:rFonts w:ascii="Aptos" w:hAnsi="Aptos"/>
         </w:rPr>
-        <w:t xml:space="preserve">The net cloud radiative effect depends on the relative amount of shallow cumulus vs. LCL clouds. Large-eddy simulation (LES; </w:t>
-      </w:r>
-      <w:r>
-        <w:rPr>
-          <w:rFonts w:ascii="Aptos" w:hAnsi="Aptos"/>
-        </w:rPr>
-        <w:t>(Bretherton et al. </w:t>
-      </w:r>
-      <w:r>
-        <w:rPr>
-          <w:rFonts w:ascii="Aptos" w:hAnsi="Aptos"/>
-        </w:rPr>
-        <w:t>2013</w:t>
-      </w:r>
-      <w:r>
-        <w:rPr>
-          <w:rFonts w:ascii="Aptos" w:hAnsi="Aptos"/>
-        </w:rPr>
-        <w:t>, Blossey et al. </w:t>
-      </w:r>
-      <w:r>
-        <w:rPr>
-          <w:rFonts w:ascii="Aptos" w:hAnsi="Aptos"/>
-        </w:rPr>
-        <w:t xml:space="preserve">2013) and observations (Bony et al., 2021; </w:t>
-      </w:r>
-      <w:r>
-        <w:rPr>
-          <w:rFonts w:ascii="Aptos" w:hAnsi="Aptos"/>
-        </w:rPr>
-        <w:t>Vogel et al.</w:t>
-      </w:r>
-      <w:r>
-        <w:rPr>
-          <w:rFonts w:ascii="Aptos" w:hAnsi="Aptos"/>
-        </w:rPr>
-        <w:t>,</w:t>
-      </w:r>
-      <w:r>
-        <w:rPr>
-          <w:rFonts w:ascii="Aptos" w:hAnsi="Aptos"/>
-        </w:rPr>
-        <w:t> 2022</w:t>
-      </w:r>
-      <w:r>
-        <w:rPr>
-          <w:rFonts w:ascii="Aptos" w:hAnsi="Aptos"/>
-        </w:rPr>
-        <w:t>; Fig. REFLALBEDO</w:t>
-      </w:r>
+        <w:t>r</w:t>
+      </w:r>
+      <w:r>
+        <w:rPr>
+          <w:rFonts w:ascii="Aptos" w:hAnsi="Aptos"/>
+        </w:rPr>
+        <w:t>elative humidity (RH) at cloud base</w:t>
+      </w:r>
+      <w:r>
+        <w:rPr>
+          <w:rFonts w:ascii="Aptos" w:hAnsi="Aptos"/>
+        </w:rPr>
+        <w:t xml:space="preserve">. RH </w:t>
+      </w:r>
+      <w:r>
+        <w:rPr>
+          <w:rFonts w:ascii="Aptos" w:hAnsi="Aptos"/>
+        </w:rPr>
+        <w:t>may be</w:t>
+      </w:r>
+      <w:r>
+        <w:rPr>
+          <w:rFonts w:ascii="Aptos" w:hAnsi="Aptos"/>
+        </w:rPr>
+        <w:t xml:space="preserve"> constant (Held and Shell XXXX</w:t>
+      </w:r>
+      <w:proofErr w:type="gramStart"/>
       <w:r>
         <w:rPr>
           <w:rFonts w:ascii="Aptos" w:hAnsi="Aptos"/>
@@ -19188,80 +19353,7 @@
         <w:rPr>
           <w:rFonts w:ascii="Aptos" w:hAnsi="Aptos"/>
         </w:rPr>
-        <w:t xml:space="preserve"> have a</w:t>
-      </w:r>
-      <w:r>
-        <w:rPr>
-          <w:rFonts w:ascii="Aptos" w:hAnsi="Aptos"/>
-        </w:rPr>
-        <w:t xml:space="preserve"> cloud fraction </w:t>
-      </w:r>
-      <w:r>
-        <w:rPr>
-          <w:rFonts w:ascii="Aptos" w:hAnsi="Aptos"/>
-        </w:rPr>
-        <w:t xml:space="preserve">maximum of </w:t>
-      </w:r>
-      <w:r>
-        <w:rPr>
-          <w:rFonts w:ascii="Aptos" w:hAnsi="Aptos"/>
-        </w:rPr>
-        <w:t xml:space="preserve">about 5 % </w:t>
-      </w:r>
-      <w:r>
-        <w:rPr>
-          <w:rFonts w:ascii="Aptos" w:hAnsi="Aptos"/>
-        </w:rPr>
-        <w:t>near the</w:t>
-      </w:r>
-      <w:r>
-        <w:rPr>
-          <w:rFonts w:ascii="Aptos" w:hAnsi="Aptos"/>
-        </w:rPr>
-        <w:t xml:space="preserve"> cloud base</w:t>
-      </w:r>
-      <w:r>
-        <w:rPr>
-          <w:rFonts w:ascii="Aptos" w:hAnsi="Aptos"/>
-        </w:rPr>
-        <w:t>.</w:t>
-      </w:r>
-      <w:r>
-        <w:rPr>
-          <w:rFonts w:ascii="Aptos" w:hAnsi="Aptos"/>
-        </w:rPr>
-        <w:t xml:space="preserve"> We s</w:t>
-      </w:r>
-      <w:r>
-        <w:rPr>
-          <w:rFonts w:ascii="Aptos" w:hAnsi="Aptos"/>
-        </w:rPr>
-        <w:t>cale th</w:t>
-      </w:r>
-      <w:r>
-        <w:rPr>
-          <w:rFonts w:ascii="Aptos" w:hAnsi="Aptos"/>
-        </w:rPr>
-        <w:t>is</w:t>
-      </w:r>
-      <w:r>
-        <w:rPr>
-          <w:rFonts w:ascii="Aptos" w:hAnsi="Aptos"/>
-        </w:rPr>
-        <w:t xml:space="preserve"> LCL cloud fraction from the subcloud relative humidity and moisture </w:t>
-      </w:r>
-      <w:proofErr w:type="gramStart"/>
-      <w:r>
-        <w:rPr>
-          <w:rFonts w:ascii="Aptos" w:hAnsi="Aptos"/>
-        </w:rPr>
-        <w:t>fluxes</w:t>
-      </w:r>
-      <w:r>
-        <w:rPr>
-          <w:rFonts w:ascii="Aptos" w:hAnsi="Aptos"/>
-        </w:rPr>
-        <w:t>, and</w:t>
+        <w:t>, or</w:t>
       </w:r>
       <w:proofErr w:type="gramEnd"/>
       <w:r>
@@ -19274,60 +19366,6 @@
         <w:rPr>
           <w:rFonts w:ascii="Aptos" w:hAnsi="Aptos"/>
         </w:rPr>
-        <w:t xml:space="preserve">test the sensitivity </w:t>
-      </w:r>
-      <w:r>
-        <w:rPr>
-          <w:rFonts w:ascii="Aptos" w:hAnsi="Aptos"/>
-        </w:rPr>
-        <w:t>of</w:t>
-      </w:r>
-      <w:r>
-        <w:rPr>
-          <w:rFonts w:ascii="Aptos" w:hAnsi="Aptos"/>
-        </w:rPr>
-        <w:t xml:space="preserve"> </w:t>
-      </w:r>
-      <w:r>
-        <w:rPr>
-          <w:rFonts w:ascii="Aptos" w:hAnsi="Aptos"/>
-        </w:rPr>
-        <w:t>r</w:t>
-      </w:r>
-      <w:r>
-        <w:rPr>
-          <w:rFonts w:ascii="Aptos" w:hAnsi="Aptos"/>
-        </w:rPr>
-        <w:t>elative humidity (RH) at cloud base</w:t>
-      </w:r>
-      <w:r>
-        <w:rPr>
-          <w:rFonts w:ascii="Aptos" w:hAnsi="Aptos"/>
-        </w:rPr>
-        <w:t xml:space="preserve">. RH </w:t>
-      </w:r>
-      <w:r>
-        <w:rPr>
-          <w:rFonts w:ascii="Aptos" w:hAnsi="Aptos"/>
-        </w:rPr>
-        <w:t>may be</w:t>
-      </w:r>
-      <w:r>
-        <w:rPr>
-          <w:rFonts w:ascii="Aptos" w:hAnsi="Aptos"/>
-        </w:rPr>
-        <w:t xml:space="preserve"> constant (Held and Shell XXXX)</w:t>
-      </w:r>
-      <w:r>
-        <w:rPr>
-          <w:rFonts w:ascii="Aptos" w:hAnsi="Aptos"/>
-        </w:rPr>
-        <w:t xml:space="preserve">, or </w:t>
-      </w:r>
-      <w:r>
-        <w:rPr>
-          <w:rFonts w:ascii="Aptos" w:hAnsi="Aptos"/>
-        </w:rPr>
         <w:t>increas</w:t>
       </w:r>
       <w:r>
@@ -19346,7 +19384,13 @@
         <w:rPr>
           <w:rFonts w:ascii="Aptos" w:hAnsi="Aptos"/>
         </w:rPr>
-        <w:t>, representing moderation of the</w:t>
+        <w:t xml:space="preserve"> to the damp</w:t>
+      </w:r>
+      <w:r>
+        <w:rPr>
+          <w:rFonts w:ascii="Aptos" w:hAnsi="Aptos"/>
+        </w:rPr>
+        <w:t xml:space="preserve"> the</w:t>
       </w:r>
       <w:r>
         <w:rPr>
@@ -20315,7 +20359,7 @@
       <w:pPr>
         <w:pStyle w:val="BodyText"/>
         <w:rPr>
-          <w:rFonts w:ascii="Aptos" w:hAnsi="Aptos"/>
+          <w:rFonts w:ascii="Aptos" w:eastAsiaTheme="minorEastAsia" w:hAnsi="Aptos"/>
         </w:rPr>
       </w:pPr>
       <w:r>
@@ -21270,26 +21314,44 @@
         <w:rPr>
           <w:rFonts w:ascii="Aptos" w:hAnsi="Aptos"/>
         </w:rPr>
-        <w:t>(</w:t>
-      </w:r>
-      <w:r>
-        <w:rPr>
-          <w:rFonts w:ascii="Aptos" w:hAnsi="Aptos"/>
-        </w:rPr>
-        <w:t xml:space="preserve">by </w:t>
-      </w:r>
-      <w:r>
-        <w:rPr>
-          <w:rFonts w:ascii="Aptos" w:hAnsi="Aptos"/>
-        </w:rPr>
-        <w:t xml:space="preserve">friction velocity </w:t>
+        <w:t>is greater</w:t>
+      </w:r>
+      <w:r>
+        <w:rPr>
+          <w:rFonts w:ascii="Aptos" w:hAnsi="Aptos"/>
+        </w:rPr>
+        <w:t xml:space="preserve"> than buoyancy </w:t>
+      </w:r>
+      <w:r>
+        <w:rPr>
+          <w:rFonts w:ascii="Aptos" w:hAnsi="Aptos"/>
+        </w:rPr>
+        <w:t>production</w:t>
+      </w:r>
+      <w:r>
+        <w:rPr>
+          <w:rFonts w:ascii="Aptos" w:hAnsi="Aptos"/>
+        </w:rPr>
+        <w:t>. Solving for humidity variance,</w:t>
+      </w:r>
+      <w:r>
+        <w:rPr>
+          <w:rFonts w:ascii="Aptos" w:hAnsi="Aptos"/>
+        </w:rPr>
+        <w:t xml:space="preserve"> the friction velocity</w:t>
+      </w:r>
+      <w:r>
+        <w:rPr>
+          <w:rFonts w:ascii="Aptos" w:hAnsi="Aptos"/>
+        </w:rPr>
+        <w:t xml:space="preserve"> </w:t>
       </w:r>
       <m:oMath>
         <m:sSup>
           <m:sSupPr>
             <m:ctrlPr>
               <w:rPr>
-                <w:rFonts w:ascii="Cambria Math" w:eastAsiaTheme="minorEastAsia" w:hAnsi="Cambria Math"/>
+                <w:rFonts w:ascii="Cambria Math" w:hAnsi="Cambria Math"/>
                 <w:i/>
               </w:rPr>
             </m:ctrlPr>
@@ -21297,7 +21359,7 @@
           <m:e>
             <m:r>
               <w:rPr>
-                <w:rFonts w:ascii="Cambria Math" w:eastAsiaTheme="minorEastAsia" w:hAnsi="Cambria Math"/>
+                <w:rFonts w:ascii="Cambria Math" w:hAnsi="Cambria Math"/>
               </w:rPr>
               <m:t>u</m:t>
             </m:r>
@@ -21305,7 +21367,7 @@
           <m:sup>
             <m:r>
               <w:rPr>
-                <w:rFonts w:ascii="Cambria Math" w:eastAsiaTheme="minorEastAsia" w:hAnsi="Cambria Math"/>
+                <w:rFonts w:ascii="Cambria Math" w:hAnsi="Cambria Math"/>
               </w:rPr>
               <m:t>*</m:t>
             </m:r>
@@ -21407,299 +21469,239 @@
         <w:rPr>
           <w:rFonts w:ascii="Aptos" w:eastAsiaTheme="minorEastAsia" w:hAnsi="Aptos"/>
         </w:rPr>
-        <w:t xml:space="preserve">) </w:t>
-      </w:r>
-      <w:r>
-        <w:rPr>
-          <w:rFonts w:ascii="Aptos" w:hAnsi="Aptos"/>
-        </w:rPr>
-        <w:t>is greater</w:t>
-      </w:r>
-      <w:r>
-        <w:rPr>
-          <w:rFonts w:ascii="Aptos" w:hAnsi="Aptos"/>
-        </w:rPr>
-        <w:t xml:space="preserve"> than buoyancy </w:t>
-      </w:r>
-      <w:r>
-        <w:rPr>
-          <w:rFonts w:ascii="Aptos" w:hAnsi="Aptos"/>
-        </w:rPr>
-        <w:t>production</w:t>
-      </w:r>
-      <w:r>
-        <w:rPr>
-          <w:rFonts w:ascii="Aptos" w:hAnsi="Aptos"/>
-        </w:rPr>
-        <w:t xml:space="preserve">. Solving for humidity variance, </w:t>
+        <w:t xml:space="preserve"> cancels</w:t>
+      </w:r>
+      <w:r>
+        <w:rPr>
+          <w:rFonts w:ascii="Aptos" w:eastAsiaTheme="minorEastAsia" w:hAnsi="Aptos"/>
+        </w:rPr>
+        <w:t xml:space="preserve"> and</w:t>
+      </w:r>
+      <w:r>
+        <w:rPr>
+          <w:rFonts w:ascii="Aptos" w:hAnsi="Aptos"/>
+        </w:rPr>
+        <w:t xml:space="preserve"> </w:t>
       </w:r>
       <m:oMath>
-        <m:sSup>
-          <m:sSupPr>
+        <m:sSubSup>
+          <m:sSubSupPr>
+            <m:ctrlPr>
+              <w:rPr>
+                <w:rFonts w:ascii="Cambria Math" w:hAnsi="Cambria Math"/>
+              </w:rPr>
+            </m:ctrlPr>
+          </m:sSubSupPr>
+          <m:e>
+            <m:r>
+              <w:rPr>
+                <w:rFonts w:ascii="Cambria Math" w:hAnsi="Cambria Math"/>
+              </w:rPr>
+              <m:t>σ</m:t>
+            </m:r>
             <m:ctrlPr>
               <w:rPr>
                 <w:rFonts w:ascii="Cambria Math" w:hAnsi="Cambria Math"/>
                 <w:i/>
               </w:rPr>
             </m:ctrlPr>
-          </m:sSupPr>
-          <m:e>
+          </m:e>
+          <m:sub>
             <m:r>
               <w:rPr>
                 <w:rFonts w:ascii="Cambria Math" w:hAnsi="Cambria Math"/>
               </w:rPr>
-              <m:t>u</m:t>
-            </m:r>
-          </m:e>
+              <m:t>q</m:t>
+            </m:r>
+          </m:sub>
           <m:sup>
             <m:r>
+              <m:rPr>
+                <m:sty m:val="p"/>
+              </m:rPr>
               <w:rPr>
                 <w:rFonts w:ascii="Cambria Math" w:hAnsi="Cambria Math"/>
               </w:rPr>
-              <m:t>*</m:t>
+              <m:t>2</m:t>
             </m:r>
           </m:sup>
-        </m:sSup>
+        </m:sSubSup>
+        <m:r>
+          <w:rPr>
+            <w:rFonts w:ascii="Cambria Math" w:hAnsi="Cambria Math"/>
+          </w:rPr>
+          <m:t>=</m:t>
+        </m:r>
+        <m:f>
+          <m:fPr>
+            <m:type m:val="lin"/>
+            <m:ctrlPr>
+              <w:rPr>
+                <w:rFonts w:ascii="Cambria Math" w:hAnsi="Cambria Math"/>
+              </w:rPr>
+            </m:ctrlPr>
+          </m:fPr>
+          <m:num>
+            <m:sSup>
+              <m:sSupPr>
+                <m:ctrlPr>
+                  <w:rPr>
+                    <w:rFonts w:ascii="Cambria Math" w:hAnsi="Cambria Math"/>
+                    <w:i/>
+                  </w:rPr>
+                </m:ctrlPr>
+              </m:sSupPr>
+              <m:e>
+                <m:r>
+                  <w:rPr>
+                    <w:rFonts w:ascii="Cambria Math" w:hAnsi="Cambria Math"/>
+                  </w:rPr>
+                  <m:t>q</m:t>
+                </m:r>
+              </m:e>
+              <m:sup>
+                <m:r>
+                  <w:rPr>
+                    <w:rFonts w:ascii="Cambria Math" w:hAnsi="Cambria Math"/>
+                  </w:rPr>
+                  <m:t>*</m:t>
+                </m:r>
+              </m:sup>
+            </m:sSup>
+            <m:d>
+              <m:dPr>
+                <m:ctrlPr>
+                  <w:rPr>
+                    <w:rFonts w:ascii="Cambria Math" w:hAnsi="Cambria Math"/>
+                  </w:rPr>
+                </m:ctrlPr>
+              </m:dPr>
+              <m:e>
+                <m:sSub>
+                  <m:sSubPr>
+                    <m:ctrlPr>
+                      <w:rPr>
+                        <w:rFonts w:ascii="Cambria Math" w:hAnsi="Cambria Math"/>
+                      </w:rPr>
+                    </m:ctrlPr>
+                  </m:sSubPr>
+                  <m:e>
+                    <m:r>
+                      <w:rPr>
+                        <w:rFonts w:ascii="Cambria Math" w:hAnsi="Cambria Math"/>
+                      </w:rPr>
+                      <m:t>q</m:t>
+                    </m:r>
+                  </m:e>
+                  <m:sub>
+                    <m:r>
+                      <m:rPr>
+                        <m:sty m:val="p"/>
+                      </m:rPr>
+                      <w:rPr>
+                        <w:rFonts w:ascii="Cambria Math" w:hAnsi="Cambria Math"/>
+                      </w:rPr>
+                      <m:t>sfc</m:t>
+                    </m:r>
+                  </m:sub>
+                </m:sSub>
+                <m:r>
+                  <m:rPr>
+                    <m:sty m:val="p"/>
+                  </m:rPr>
+                  <w:rPr>
+                    <w:rFonts w:ascii="Cambria Math" w:hAnsi="Cambria Math"/>
+                  </w:rPr>
+                  <m:t>-</m:t>
+                </m:r>
+                <m:sSub>
+                  <m:sSubPr>
+                    <m:ctrlPr>
+                      <w:rPr>
+                        <w:rFonts w:ascii="Cambria Math" w:hAnsi="Cambria Math"/>
+                      </w:rPr>
+                    </m:ctrlPr>
+                  </m:sSubPr>
+                  <m:e>
+                    <m:r>
+                      <w:rPr>
+                        <w:rFonts w:ascii="Cambria Math" w:hAnsi="Cambria Math"/>
+                      </w:rPr>
+                      <m:t>q</m:t>
+                    </m:r>
+                  </m:e>
+                  <m:sub>
+                    <m:r>
+                      <w:rPr>
+                        <w:rFonts w:ascii="Cambria Math" w:hAnsi="Cambria Math"/>
+                      </w:rPr>
+                      <m:t>CB</m:t>
+                    </m:r>
+                  </m:sub>
+                </m:sSub>
+              </m:e>
+            </m:d>
+            <m:ctrlPr>
+              <w:rPr>
+                <w:rFonts w:ascii="Cambria Math" w:hAnsi="Cambria Math"/>
+                <w:i/>
+              </w:rPr>
+            </m:ctrlPr>
+          </m:num>
+          <m:den>
+            <m:sSub>
+              <m:sSubPr>
+                <m:ctrlPr>
+                  <w:rPr>
+                    <w:rFonts w:ascii="Cambria Math" w:hAnsi="Cambria Math"/>
+                    <w:i/>
+                    <w:iCs/>
+                  </w:rPr>
+                </m:ctrlPr>
+              </m:sSubPr>
+              <m:e>
+                <m:r>
+                  <w:rPr>
+                    <w:rFonts w:ascii="Cambria Math" w:hAnsi="Cambria Math"/>
+                  </w:rPr>
+                  <m:t>k</m:t>
+                </m:r>
+                <m:ctrlPr>
+                  <w:rPr>
+                    <w:rFonts w:ascii="Cambria Math" w:hAnsi="Cambria Math"/>
+                  </w:rPr>
+                </m:ctrlPr>
+              </m:e>
+              <m:sub>
+                <m:r>
+                  <w:rPr>
+                    <w:rFonts w:ascii="Cambria Math" w:hAnsi="Cambria Math"/>
+                  </w:rPr>
+                  <m:t>1</m:t>
+                </m:r>
+              </m:sub>
+            </m:sSub>
+          </m:den>
+        </m:f>
+        <m:r>
+          <m:rPr>
+            <m:sty m:val="p"/>
+          </m:rPr>
+          <w:rPr>
+            <w:rFonts w:ascii="Cambria Math" w:hAnsi="Cambria Math"/>
+          </w:rPr>
+          <m:t>.</m:t>
+        </m:r>
+        <m:r>
+          <m:rPr>
+            <m:sty m:val="p"/>
+          </m:rPr>
+          <w:rPr>
+            <w:rFonts w:ascii="Cambria Math" w:hAnsi="Cambria Math"/>
+          </w:rPr>
+          <m:t xml:space="preserve"> </m:t>
+        </m:r>
       </m:oMath>
-      <w:r>
-        <w:rPr>
-          <w:rFonts w:ascii="Aptos" w:eastAsiaTheme="minorEastAsia" w:hAnsi="Aptos"/>
-        </w:rPr>
-        <w:t xml:space="preserve"> cancels</w:t>
-      </w:r>
-      <w:r>
-        <w:rPr>
-          <w:rFonts w:ascii="Aptos" w:eastAsiaTheme="minorEastAsia" w:hAnsi="Aptos"/>
-        </w:rPr>
-        <w:t xml:space="preserve"> and</w:t>
-      </w:r>
-      <w:r>
-        <w:rPr>
-          <w:rFonts w:ascii="Aptos" w:hAnsi="Aptos"/>
-        </w:rPr>
-        <w:br/>
-      </w:r>
-      <m:oMathPara>
-        <m:oMath>
-          <m:sSubSup>
-            <m:sSubSupPr>
-              <m:ctrlPr>
-                <w:rPr>
-                  <w:rFonts w:ascii="Cambria Math" w:hAnsi="Cambria Math"/>
-                </w:rPr>
-              </m:ctrlPr>
-            </m:sSubSupPr>
-            <m:e>
-              <m:r>
-                <w:rPr>
-                  <w:rFonts w:ascii="Cambria Math" w:hAnsi="Cambria Math"/>
-                </w:rPr>
-                <m:t>σ</m:t>
-              </m:r>
-              <m:ctrlPr>
-                <w:rPr>
-                  <w:rFonts w:ascii="Cambria Math" w:hAnsi="Cambria Math"/>
-                  <w:i/>
-                </w:rPr>
-              </m:ctrlPr>
-            </m:e>
-            <m:sub>
-              <m:r>
-                <w:rPr>
-                  <w:rFonts w:ascii="Cambria Math" w:hAnsi="Cambria Math"/>
-                </w:rPr>
-                <m:t>q</m:t>
-              </m:r>
-            </m:sub>
-            <m:sup>
-              <m:r>
-                <m:rPr>
-                  <m:sty m:val="p"/>
-                </m:rPr>
-                <w:rPr>
-                  <w:rFonts w:ascii="Cambria Math" w:hAnsi="Cambria Math"/>
-                </w:rPr>
-                <m:t>2</m:t>
-              </m:r>
-            </m:sup>
-          </m:sSubSup>
-          <m:r>
-            <w:rPr>
-              <w:rFonts w:ascii="Cambria Math" w:hAnsi="Cambria Math"/>
-            </w:rPr>
-            <m:t>=</m:t>
-          </m:r>
-          <m:f>
-            <m:fPr>
-              <m:type m:val="lin"/>
-              <m:ctrlPr>
-                <w:rPr>
-                  <w:rFonts w:ascii="Cambria Math" w:hAnsi="Cambria Math"/>
-                </w:rPr>
-              </m:ctrlPr>
-            </m:fPr>
-            <m:num>
-              <m:sSup>
-                <m:sSupPr>
-                  <m:ctrlPr>
-                    <w:rPr>
-                      <w:rFonts w:ascii="Cambria Math" w:hAnsi="Cambria Math"/>
-                      <w:i/>
-                    </w:rPr>
-                  </m:ctrlPr>
-                </m:sSupPr>
-                <m:e>
-                  <m:r>
-                    <w:rPr>
-                      <w:rFonts w:ascii="Cambria Math" w:hAnsi="Cambria Math"/>
-                    </w:rPr>
-                    <m:t>q</m:t>
-                  </m:r>
-                </m:e>
-                <m:sup>
-                  <m:r>
-                    <w:rPr>
-                      <w:rFonts w:ascii="Cambria Math" w:hAnsi="Cambria Math"/>
-                    </w:rPr>
-                    <m:t>*</m:t>
-                  </m:r>
-                </m:sup>
-              </m:sSup>
-              <m:d>
-                <m:dPr>
-                  <m:ctrlPr>
-                    <w:rPr>
-                      <w:rFonts w:ascii="Cambria Math" w:hAnsi="Cambria Math"/>
-                    </w:rPr>
-                  </m:ctrlPr>
-                </m:dPr>
-                <m:e>
-                  <m:sSub>
-                    <m:sSubPr>
-                      <m:ctrlPr>
-                        <w:rPr>
-                          <w:rFonts w:ascii="Cambria Math" w:hAnsi="Cambria Math"/>
-                        </w:rPr>
-                      </m:ctrlPr>
-                    </m:sSubPr>
-                    <m:e>
-                      <m:r>
-                        <w:rPr>
-                          <w:rFonts w:ascii="Cambria Math" w:hAnsi="Cambria Math"/>
-                        </w:rPr>
-                        <m:t>q</m:t>
-                      </m:r>
-                    </m:e>
-                    <m:sub>
-                      <m:r>
-                        <m:rPr>
-                          <m:sty m:val="p"/>
-                        </m:rPr>
-                        <w:rPr>
-                          <w:rFonts w:ascii="Cambria Math" w:hAnsi="Cambria Math"/>
-                        </w:rPr>
-                        <m:t>sfc</m:t>
-                      </m:r>
-                    </m:sub>
-                  </m:sSub>
-                  <m:r>
-                    <m:rPr>
-                      <m:sty m:val="p"/>
-                    </m:rPr>
-                    <w:rPr>
-                      <w:rFonts w:ascii="Cambria Math" w:hAnsi="Cambria Math"/>
-                    </w:rPr>
-                    <m:t>-</m:t>
-                  </m:r>
-                  <m:sSub>
-                    <m:sSubPr>
-                      <m:ctrlPr>
-                        <w:rPr>
-                          <w:rFonts w:ascii="Cambria Math" w:hAnsi="Cambria Math"/>
-                        </w:rPr>
-                      </m:ctrlPr>
-                    </m:sSubPr>
-                    <m:e>
-                      <m:r>
-                        <w:rPr>
-                          <w:rFonts w:ascii="Cambria Math" w:hAnsi="Cambria Math"/>
-                        </w:rPr>
-                        <m:t>q</m:t>
-                      </m:r>
-                    </m:e>
-                    <m:sub>
-                      <m:r>
-                        <w:rPr>
-                          <w:rFonts w:ascii="Cambria Math" w:hAnsi="Cambria Math"/>
-                        </w:rPr>
-                        <m:t>CB</m:t>
-                      </m:r>
-                    </m:sub>
-                  </m:sSub>
-                </m:e>
-              </m:d>
-              <m:ctrlPr>
-                <w:rPr>
-                  <w:rFonts w:ascii="Cambria Math" w:hAnsi="Cambria Math"/>
-                  <w:i/>
-                </w:rPr>
-              </m:ctrlPr>
-            </m:num>
-            <m:den>
-              <m:sSub>
-                <m:sSubPr>
-                  <m:ctrlPr>
-                    <w:rPr>
-                      <w:rFonts w:ascii="Cambria Math" w:hAnsi="Cambria Math"/>
-                      <w:i/>
-                      <w:iCs/>
-                    </w:rPr>
-                  </m:ctrlPr>
-                </m:sSubPr>
-                <m:e>
-                  <m:r>
-                    <w:rPr>
-                      <w:rFonts w:ascii="Cambria Math" w:hAnsi="Cambria Math"/>
-                    </w:rPr>
-                    <m:t>k</m:t>
-                  </m:r>
-                  <m:ctrlPr>
-                    <w:rPr>
-                      <w:rFonts w:ascii="Cambria Math" w:hAnsi="Cambria Math"/>
-                    </w:rPr>
-                  </m:ctrlPr>
-                </m:e>
-                <m:sub>
-                  <m:r>
-                    <w:rPr>
-                      <w:rFonts w:ascii="Cambria Math" w:hAnsi="Cambria Math"/>
-                    </w:rPr>
-                    <m:t>1</m:t>
-                  </m:r>
-                </m:sub>
-              </m:sSub>
-            </m:den>
-          </m:f>
-          <m:r>
-            <m:rPr>
-              <m:sty m:val="p"/>
-            </m:rPr>
-            <w:rPr>
-              <w:rFonts w:ascii="Cambria Math" w:hAnsi="Cambria Math"/>
-            </w:rPr>
-            <m:t>.</m:t>
-          </m:r>
-          <m:r>
-            <m:rPr>
-              <m:sty m:val="p"/>
-            </m:rPr>
-            <w:rPr>
-              <w:rFonts w:ascii="Cambria Math" w:hAnsi="Cambria Math"/>
-            </w:rPr>
-            <w:br/>
-          </m:r>
-        </m:oMath>
-      </m:oMathPara>
       <w:r>
         <w:rPr>
           <w:rFonts w:ascii="Aptos" w:eastAsiaTheme="minorEastAsia" w:hAnsi="Aptos"/>
@@ -22143,7 +22145,13 @@
         <w:rPr>
           <w:rFonts w:ascii="Aptos" w:hAnsi="Aptos"/>
         </w:rPr>
-        <w:t xml:space="preserve">is proportional to </w:t>
+        <w:t>depends on</w:t>
+      </w:r>
+      <w:r>
+        <w:rPr>
+          <w:rFonts w:ascii="Aptos" w:hAnsi="Aptos"/>
+        </w:rPr>
+        <w:t xml:space="preserve"> </w:t>
       </w:r>
       <w:r>
         <w:rPr>
@@ -22265,7 +22273,14 @@
         <w:rPr>
           <w:rFonts w:ascii="Aptos" w:hAnsi="Aptos"/>
         </w:rPr>
-        <w:t xml:space="preserve">, and the </w:t>
+        <w:t xml:space="preserve">, and </w:t>
+      </w:r>
+      <w:r>
+        <w:rPr>
+          <w:rFonts w:ascii="Aptos" w:hAnsi="Aptos"/>
+        </w:rPr>
+        <w:lastRenderedPageBreak/>
+        <w:t xml:space="preserve">the </w:t>
       </w:r>
       <w:r>
         <w:rPr>
@@ -22323,112 +22338,49 @@
         <w:rPr>
           <w:rFonts w:ascii="Aptos" w:hAnsi="Aptos"/>
         </w:rPr>
-        <w:t xml:space="preserve"> The specific humidities </w:t>
-      </w:r>
-      <m:oMath>
-        <m:sSub>
-          <m:sSubPr>
-            <m:ctrlPr>
-              <w:rPr>
-                <w:rFonts w:ascii="Cambria Math" w:hAnsi="Cambria Math"/>
-                <w:i/>
-              </w:rPr>
-            </m:ctrlPr>
-          </m:sSubPr>
-          <m:e>
-            <m:r>
-              <w:rPr>
-                <w:rFonts w:ascii="Cambria Math" w:hAnsi="Cambria Math"/>
-              </w:rPr>
-              <m:t>q</m:t>
-            </m:r>
-          </m:e>
-          <m:sub>
-            <m:r>
-              <m:rPr>
-                <m:sty m:val="p"/>
-              </m:rPr>
-              <w:rPr>
-                <w:rFonts w:ascii="Cambria Math" w:hAnsi="Cambria Math"/>
-              </w:rPr>
-              <m:t>sfc</m:t>
-            </m:r>
-          </m:sub>
-        </m:sSub>
-      </m:oMath>
+        <w:t xml:space="preserve"> </w:t>
+      </w:r>
+      <w:r>
+        <w:rPr>
+          <w:rFonts w:ascii="Aptos" w:hAnsi="Aptos"/>
+        </w:rPr>
+        <w:t xml:space="preserve">Absent another reason, we assume </w:t>
+      </w:r>
+      <w:r>
+        <w:rPr>
+          <w:rFonts w:ascii="Aptos" w:hAnsi="Aptos"/>
+        </w:rPr>
+        <w:t>specific humidit</w:t>
+      </w:r>
+      <w:r>
+        <w:rPr>
+          <w:rFonts w:ascii="Aptos" w:hAnsi="Aptos"/>
+        </w:rPr>
+        <w:t>y gradient</w:t>
+      </w:r>
+      <w:r>
+        <w:rPr>
+          <w:rFonts w:ascii="Aptos" w:hAnsi="Aptos"/>
+        </w:rPr>
+        <w:t xml:space="preserve"> </w:t>
+      </w:r>
       <w:r>
         <w:rPr>
           <w:rFonts w:ascii="Aptos" w:eastAsiaTheme="minorEastAsia" w:hAnsi="Aptos"/>
         </w:rPr>
-        <w:t xml:space="preserve">, </w:t>
-      </w:r>
-      <m:oMath>
-        <m:sSub>
-          <m:sSubPr>
-            <m:ctrlPr>
-              <w:rPr>
-                <w:rFonts w:ascii="Cambria Math" w:eastAsiaTheme="minorEastAsia" w:hAnsi="Cambria Math"/>
-                <w:i/>
-              </w:rPr>
-            </m:ctrlPr>
-          </m:sSubPr>
-          <m:e>
-            <m:r>
-              <w:rPr>
-                <w:rFonts w:ascii="Cambria Math" w:eastAsiaTheme="minorEastAsia" w:hAnsi="Cambria Math"/>
-              </w:rPr>
-              <m:t>q</m:t>
-            </m:r>
-          </m:e>
-          <m:sub>
-            <m:r>
-              <w:rPr>
-                <w:rFonts w:ascii="Cambria Math" w:eastAsiaTheme="minorEastAsia" w:hAnsi="Cambria Math"/>
-              </w:rPr>
-              <m:t>CB</m:t>
-            </m:r>
-          </m:sub>
-        </m:sSub>
-      </m:oMath>
+        <w:t>scale</w:t>
+      </w:r>
       <w:r>
         <w:rPr>
           <w:rFonts w:ascii="Aptos" w:eastAsiaTheme="minorEastAsia" w:hAnsi="Aptos"/>
         </w:rPr>
-        <w:t xml:space="preserve">, and </w:t>
-      </w:r>
-      <m:oMath>
-        <m:sSub>
-          <m:sSubPr>
-            <m:ctrlPr>
-              <w:rPr>
-                <w:rFonts w:ascii="Cambria Math" w:eastAsiaTheme="minorEastAsia" w:hAnsi="Cambria Math"/>
-                <w:i/>
-              </w:rPr>
-            </m:ctrlPr>
-          </m:sSubPr>
-          <m:e>
-            <m:r>
-              <w:rPr>
-                <w:rFonts w:ascii="Cambria Math" w:eastAsiaTheme="minorEastAsia" w:hAnsi="Cambria Math"/>
-              </w:rPr>
-              <m:t>q</m:t>
-            </m:r>
-          </m:e>
-          <m:sub>
-            <m:r>
-              <w:rPr>
-                <w:rFonts w:ascii="Cambria Math" w:eastAsiaTheme="minorEastAsia" w:hAnsi="Cambria Math"/>
-              </w:rPr>
-              <m:t>s,CB</m:t>
-            </m:r>
-          </m:sub>
-        </m:sSub>
-      </m:oMath>
+        <w:t>s</w:t>
+      </w:r>
       <w:r>
         <w:rPr>
           <w:rFonts w:ascii="Aptos" w:eastAsiaTheme="minorEastAsia" w:hAnsi="Aptos"/>
         </w:rPr>
-        <w:t xml:space="preserve"> should all scale as +7% K</w:t>
+        <w:t xml:space="preserve"> as +7% K</w:t>
       </w:r>
       <w:r>
         <w:rPr>
@@ -22446,21 +22398,142 @@
       <w:r>
         <w:rPr>
           <w:rFonts w:ascii="Aptos" w:eastAsiaTheme="minorEastAsia" w:hAnsi="Aptos"/>
+        </w:rPr>
+        <w:t xml:space="preserve"> the change of</w:t>
+      </w:r>
+      <w:r>
+        <w:rPr>
+          <w:rFonts w:ascii="Aptos" w:eastAsiaTheme="minorEastAsia" w:hAnsi="Aptos"/>
           <w:iCs/>
         </w:rPr>
         <w:t xml:space="preserve"> </w:t>
       </w:r>
-      <w:r>
-        <w:rPr>
-          <w:rFonts w:ascii="Aptos" w:hAnsi="Aptos"/>
-        </w:rPr>
-        <w:t xml:space="preserve">the change </w:t>
-      </w:r>
-      <w:r>
-        <w:rPr>
-          <w:rFonts w:ascii="Aptos" w:hAnsi="Aptos"/>
-        </w:rPr>
-        <w:t xml:space="preserve">is </w:t>
+      <m:oMath>
+        <m:f>
+          <m:fPr>
+            <m:type m:val="lin"/>
+            <m:ctrlPr>
+              <w:rPr>
+                <w:rFonts w:ascii="Cambria Math" w:hAnsi="Cambria Math"/>
+              </w:rPr>
+            </m:ctrlPr>
+          </m:fPr>
+          <m:num>
+            <m:d>
+              <m:dPr>
+                <m:ctrlPr>
+                  <w:rPr>
+                    <w:rFonts w:ascii="Cambria Math" w:hAnsi="Cambria Math"/>
+                  </w:rPr>
+                </m:ctrlPr>
+              </m:dPr>
+              <m:e>
+                <m:sSub>
+                  <m:sSubPr>
+                    <m:ctrlPr>
+                      <w:rPr>
+                        <w:rFonts w:ascii="Cambria Math" w:hAnsi="Cambria Math"/>
+                      </w:rPr>
+                    </m:ctrlPr>
+                  </m:sSubPr>
+                  <m:e>
+                    <m:r>
+                      <w:rPr>
+                        <w:rFonts w:ascii="Cambria Math" w:hAnsi="Cambria Math"/>
+                      </w:rPr>
+                      <m:t>q</m:t>
+                    </m:r>
+                  </m:e>
+                  <m:sub>
+                    <m:r>
+                      <m:rPr>
+                        <m:sty m:val="p"/>
+                      </m:rPr>
+                      <w:rPr>
+                        <w:rFonts w:ascii="Cambria Math" w:hAnsi="Cambria Math"/>
+                      </w:rPr>
+                      <m:t>sfc</m:t>
+                    </m:r>
+                  </m:sub>
+                </m:sSub>
+                <m:r>
+                  <m:rPr>
+                    <m:sty m:val="p"/>
+                  </m:rPr>
+                  <w:rPr>
+                    <w:rFonts w:ascii="Cambria Math" w:hAnsi="Cambria Math"/>
+                  </w:rPr>
+                  <m:t>-</m:t>
+                </m:r>
+                <m:sSub>
+                  <m:sSubPr>
+                    <m:ctrlPr>
+                      <w:rPr>
+                        <w:rFonts w:ascii="Cambria Math" w:hAnsi="Cambria Math"/>
+                      </w:rPr>
+                    </m:ctrlPr>
+                  </m:sSubPr>
+                  <m:e>
+                    <m:r>
+                      <w:rPr>
+                        <w:rFonts w:ascii="Cambria Math" w:hAnsi="Cambria Math"/>
+                      </w:rPr>
+                      <m:t>q</m:t>
+                    </m:r>
+                  </m:e>
+                  <m:sub>
+                    <m:r>
+                      <w:rPr>
+                        <w:rFonts w:ascii="Cambria Math" w:hAnsi="Cambria Math"/>
+                      </w:rPr>
+                      <m:t>CB</m:t>
+                    </m:r>
+                  </m:sub>
+                </m:sSub>
+              </m:e>
+            </m:d>
+          </m:num>
+          <m:den>
+            <m:sSub>
+              <m:sSubPr>
+                <m:ctrlPr>
+                  <w:rPr>
+                    <w:rFonts w:ascii="Cambria Math" w:hAnsi="Cambria Math"/>
+                    <w:i/>
+                  </w:rPr>
+                </m:ctrlPr>
+              </m:sSubPr>
+              <m:e>
+                <m:r>
+                  <w:rPr>
+                    <w:rFonts w:ascii="Cambria Math" w:hAnsi="Cambria Math"/>
+                  </w:rPr>
+                  <m:t>q</m:t>
+                </m:r>
+              </m:e>
+              <m:sub>
+                <m:r>
+                  <w:rPr>
+                    <w:rFonts w:ascii="Cambria Math" w:hAnsi="Cambria Math"/>
+                  </w:rPr>
+                  <m:t>s,CB</m:t>
+                </m:r>
+              </m:sub>
+            </m:sSub>
+          </m:den>
+        </m:f>
+      </m:oMath>
+      <w:r>
+        <w:rPr>
+          <w:rFonts w:ascii="Aptos" w:eastAsiaTheme="minorEastAsia" w:hAnsi="Aptos"/>
+        </w:rPr>
+        <w:t xml:space="preserve"> </w:t>
+      </w:r>
+      <w:r>
+        <w:rPr>
+          <w:rFonts w:ascii="Aptos" w:hAnsi="Aptos"/>
+        </w:rPr>
+        <w:t>cancels and</w:t>
       </w:r>
       <w:r>
         <w:rPr>
@@ -22734,16 +22807,14 @@
             </w:rPr>
             <m:t>.</m:t>
           </m:r>
+          <m:r>
+            <w:rPr>
+              <w:rFonts w:ascii="Aptos" w:eastAsiaTheme="minorEastAsia" w:hAnsi="Aptos"/>
+            </w:rPr>
+            <w:br/>
+          </m:r>
         </m:oMath>
       </m:oMathPara>
-    </w:p>
-    <w:p>
-      <w:pPr>
-        <w:pStyle w:val="BodyText"/>
-        <w:rPr>
-          <w:rFonts w:ascii="Aptos" w:eastAsiaTheme="minorEastAsia" w:hAnsi="Aptos"/>
-        </w:rPr>
-      </w:pPr>
       <w:r>
         <w:rPr>
           <w:rFonts w:ascii="Aptos" w:hAnsi="Aptos"/>
@@ -23811,6 +23882,12 @@
         <w:rPr>
           <w:rFonts w:ascii="Aptos" w:eastAsiaTheme="minorEastAsia" w:hAnsi="Aptos"/>
         </w:rPr>
+        <w:t xml:space="preserve"> each</w:t>
+      </w:r>
+      <w:r>
+        <w:rPr>
+          <w:rFonts w:ascii="Aptos" w:eastAsiaTheme="minorEastAsia" w:hAnsi="Aptos"/>
+        </w:rPr>
         <w:t xml:space="preserve"> bounded by 0 and 1</w:t>
       </w:r>
       <w:r>
@@ -24169,7 +24246,75 @@
         <w:rPr>
           <w:rFonts w:ascii="Aptos" w:eastAsiaTheme="minorEastAsia" w:hAnsi="Aptos"/>
         </w:rPr>
-        <w:t xml:space="preserve">. The surface saturation deficit depends on a second coefficient </w:t>
+        <w:t>.</w:t>
+      </w:r>
+    </w:p>
+    <w:p>
+      <w:pPr>
+        <w:tabs>
+          <w:tab w:val="left" w:pos="560"/>
+          <w:tab w:val="left" w:pos="1120"/>
+          <w:tab w:val="left" w:pos="1680"/>
+          <w:tab w:val="left" w:pos="2240"/>
+          <w:tab w:val="left" w:pos="2800"/>
+          <w:tab w:val="left" w:pos="3360"/>
+          <w:tab w:val="left" w:pos="3920"/>
+          <w:tab w:val="left" w:pos="4480"/>
+          <w:tab w:val="left" w:pos="5040"/>
+          <w:tab w:val="left" w:pos="5600"/>
+          <w:tab w:val="left" w:pos="6160"/>
+          <w:tab w:val="left" w:pos="6720"/>
+        </w:tabs>
+        <w:autoSpaceDE w:val="0"/>
+        <w:autoSpaceDN w:val="0"/>
+        <w:adjustRightInd w:val="0"/>
+        <w:spacing w:after="0" w:line="240" w:lineRule="auto"/>
+        <w:rPr>
+          <w:rFonts w:ascii="Aptos" w:eastAsiaTheme="minorEastAsia" w:hAnsi="Aptos"/>
+        </w:rPr>
+      </w:pPr>
+    </w:p>
+    <w:p>
+      <w:pPr>
+        <w:tabs>
+          <w:tab w:val="left" w:pos="560"/>
+          <w:tab w:val="left" w:pos="1120"/>
+          <w:tab w:val="left" w:pos="1680"/>
+          <w:tab w:val="left" w:pos="2240"/>
+          <w:tab w:val="left" w:pos="2800"/>
+          <w:tab w:val="left" w:pos="3360"/>
+          <w:tab w:val="left" w:pos="3920"/>
+          <w:tab w:val="left" w:pos="4480"/>
+          <w:tab w:val="left" w:pos="5040"/>
+          <w:tab w:val="left" w:pos="5600"/>
+          <w:tab w:val="left" w:pos="6160"/>
+          <w:tab w:val="left" w:pos="6720"/>
+        </w:tabs>
+        <w:autoSpaceDE w:val="0"/>
+        <w:autoSpaceDN w:val="0"/>
+        <w:adjustRightInd w:val="0"/>
+        <w:spacing w:after="0" w:line="240" w:lineRule="auto"/>
+        <w:rPr>
+          <w:rFonts w:ascii="Aptos" w:eastAsiaTheme="minorEastAsia" w:hAnsi="Aptos"/>
+        </w:rPr>
+      </w:pPr>
+      <w:r>
+        <w:rPr>
+          <w:rFonts w:ascii="Aptos" w:eastAsiaTheme="minorEastAsia" w:hAnsi="Aptos"/>
+        </w:rPr>
+        <w:t xml:space="preserve">The surface saturation deficit depends on </w:t>
+      </w:r>
+      <w:r>
+        <w:rPr>
+          <w:rFonts w:ascii="Aptos" w:eastAsiaTheme="minorEastAsia" w:hAnsi="Aptos"/>
+        </w:rPr>
+        <w:t>the</w:t>
+      </w:r>
+      <w:r>
+        <w:rPr>
+          <w:rFonts w:ascii="Aptos" w:eastAsiaTheme="minorEastAsia" w:hAnsi="Aptos"/>
+        </w:rPr>
+        <w:t xml:space="preserve"> second coefficient </w:t>
       </w:r>
       <m:oMath>
         <m:r>
@@ -25338,22 +25483,13 @@
         </w:rPr>
         <w:t xml:space="preserve">The </w:t>
       </w:r>
-      <w:proofErr w:type="spellStart"/>
       <w:r>
         <w:rPr>
           <w:rFonts w:ascii="Aptos" w:eastAsiaTheme="minorEastAsia" w:hAnsi="Aptos"/>
           <w:iCs/>
         </w:rPr>
-        <w:t>parameter</w:t>
-      </w:r>
-      <w:r>
-        <w:rPr>
-          <w:rFonts w:ascii="Aptos" w:eastAsiaTheme="minorEastAsia" w:hAnsi="Aptos"/>
-          <w:iCs/>
-        </w:rPr>
-        <w:t>ic</w:t>
-      </w:r>
-      <w:proofErr w:type="spellEnd"/>
+        <w:t>parametric</w:t>
+      </w:r>
       <w:r>
         <w:rPr>
           <w:rFonts w:ascii="Aptos" w:eastAsiaTheme="minorEastAsia" w:hAnsi="Aptos"/>
@@ -25503,7 +25639,14 @@
           <w:rFonts w:ascii="Aptos" w:eastAsiaTheme="minorEastAsia" w:hAnsi="Aptos"/>
           <w:iCs/>
         </w:rPr>
-        <w:t xml:space="preserve">Between –0.5 and +0.5, </w:t>
+        <w:t>The parameter</w:t>
+      </w:r>
+      <w:r>
+        <w:rPr>
+          <w:rFonts w:ascii="Aptos" w:eastAsiaTheme="minorEastAsia" w:hAnsi="Aptos"/>
+          <w:iCs/>
+        </w:rPr>
+        <w:t xml:space="preserve"> </w:t>
       </w:r>
       <m:oMath>
         <m:r>
@@ -25584,7 +25727,21 @@
           <w:rFonts w:ascii="Aptos" w:eastAsiaTheme="minorEastAsia" w:hAnsi="Aptos"/>
           <w:iCs/>
         </w:rPr>
-        <w:t xml:space="preserve"> multiplies </w:t>
+        <w:t xml:space="preserve"> </w:t>
+      </w:r>
+      <w:r>
+        <w:rPr>
+          <w:rFonts w:ascii="Aptos" w:eastAsiaTheme="minorEastAsia" w:hAnsi="Aptos"/>
+          <w:iCs/>
+        </w:rPr>
+        <w:t xml:space="preserve">is between –0.5 and +0.5. It </w:t>
+      </w:r>
+      <w:r>
+        <w:rPr>
+          <w:rFonts w:ascii="Aptos" w:eastAsiaTheme="minorEastAsia" w:hAnsi="Aptos"/>
+          <w:iCs/>
+        </w:rPr>
+        <w:t xml:space="preserve">multiplies </w:t>
       </w:r>
       <w:r>
         <w:rPr>
@@ -26890,7 +27047,19 @@
         <w:rPr>
           <w:rFonts w:ascii="Aptos" w:eastAsiaTheme="minorEastAsia" w:hAnsi="Aptos"/>
         </w:rPr>
-        <w:t xml:space="preserve">, and surface saturation deficit and RH are constant. </w:t>
+        <w:t>, and surface saturation deficit and RH are constant</w:t>
+      </w:r>
+      <w:r>
+        <w:rPr>
+          <w:rFonts w:ascii="Aptos" w:eastAsiaTheme="minorEastAsia" w:hAnsi="Aptos"/>
+        </w:rPr>
+        <w:t>, having no effect on clouds</w:t>
+      </w:r>
+      <w:r>
+        <w:rPr>
+          <w:rFonts w:ascii="Aptos" w:eastAsiaTheme="minorEastAsia" w:hAnsi="Aptos"/>
+        </w:rPr>
+        <w:t xml:space="preserve">. </w:t>
       </w:r>
       <w:r>
         <w:rPr>
@@ -27193,7 +27362,65 @@
         <w:rPr>
           <w:rFonts w:ascii="Aptos" w:eastAsiaTheme="minorEastAsia" w:hAnsi="Aptos"/>
         </w:rPr>
-        <w:t>, the two competing effects, increasing mean RH and narrowing its width, balance.</w:t>
+        <w:t>, the two competing effects</w:t>
+      </w:r>
+      <w:r>
+        <w:rPr>
+          <w:rFonts w:ascii="Aptos" w:eastAsiaTheme="minorEastAsia" w:hAnsi="Aptos"/>
+        </w:rPr>
+        <w:t>—</w:t>
+      </w:r>
+      <w:r>
+        <w:rPr>
+          <w:rFonts w:ascii="Aptos" w:eastAsiaTheme="minorEastAsia" w:hAnsi="Aptos"/>
+        </w:rPr>
+        <w:t xml:space="preserve">increasing mean RH and narrowing its </w:t>
+      </w:r>
+      <w:r>
+        <w:rPr>
+          <w:rFonts w:ascii="Aptos" w:eastAsiaTheme="minorEastAsia" w:hAnsi="Aptos"/>
+        </w:rPr>
+        <w:t xml:space="preserve">standard deviation </w:t>
+      </w:r>
+      <m:oMath>
+        <m:sSub>
+          <m:sSubPr>
+            <m:ctrlPr>
+              <w:rPr>
+                <w:rFonts w:ascii="Cambria Math" w:eastAsiaTheme="minorEastAsia" w:hAnsi="Cambria Math"/>
+                <w:i/>
+              </w:rPr>
+            </m:ctrlPr>
+          </m:sSubPr>
+          <m:e>
+            <m:r>
+              <w:rPr>
+                <w:rFonts w:ascii="Cambria Math" w:eastAsiaTheme="minorEastAsia" w:hAnsi="Cambria Math"/>
+              </w:rPr>
+              <m:t>σ</m:t>
+            </m:r>
+          </m:e>
+          <m:sub>
+            <m:r>
+              <w:rPr>
+                <w:rFonts w:ascii="Cambria Math" w:eastAsiaTheme="minorEastAsia" w:hAnsi="Cambria Math"/>
+              </w:rPr>
+              <m:t>RH</m:t>
+            </m:r>
+          </m:sub>
+        </m:sSub>
+      </m:oMath>
+      <w:r>
+        <w:rPr>
+          <w:rFonts w:ascii="Aptos" w:eastAsiaTheme="minorEastAsia" w:hAnsi="Aptos"/>
+        </w:rPr>
+        <w:t>—</w:t>
+      </w:r>
+      <w:r>
+        <w:rPr>
+          <w:rFonts w:ascii="Aptos" w:eastAsiaTheme="minorEastAsia" w:hAnsi="Aptos"/>
+        </w:rPr>
+        <w:t>balance.</w:t>
       </w:r>
     </w:p>
     <w:p>
@@ -27869,7 +28096,61 @@
         <w:rPr>
           <w:rFonts w:ascii="Aptos" w:hAnsi="Aptos"/>
         </w:rPr>
-        <w:t>Though the sign of the change of the LCL clouds is unclear, a simple scaling of the RH highlights its sensitivity to the mean RH, RH gradients, and moisture flux</w:t>
+        <w:t>This</w:t>
+      </w:r>
+      <w:r>
+        <w:rPr>
+          <w:rFonts w:ascii="Aptos" w:hAnsi="Aptos"/>
+        </w:rPr>
+        <w:t xml:space="preserve"> simple scaling of the </w:t>
+      </w:r>
+      <w:r>
+        <w:rPr>
+          <w:rFonts w:ascii="Aptos" w:hAnsi="Aptos"/>
+        </w:rPr>
+        <w:t xml:space="preserve">LCL clouds to the subcloud </w:t>
+      </w:r>
+      <w:r>
+        <w:rPr>
+          <w:rFonts w:ascii="Aptos" w:hAnsi="Aptos"/>
+        </w:rPr>
+        <w:t xml:space="preserve">RH </w:t>
+      </w:r>
+      <w:r>
+        <w:rPr>
+          <w:rFonts w:ascii="Aptos" w:hAnsi="Aptos"/>
+        </w:rPr>
+        <w:t>fluctuations demonstrates</w:t>
+      </w:r>
+      <w:r>
+        <w:rPr>
+          <w:rFonts w:ascii="Aptos" w:hAnsi="Aptos"/>
+        </w:rPr>
+        <w:t xml:space="preserve"> </w:t>
+      </w:r>
+      <w:r>
+        <w:rPr>
+          <w:rFonts w:ascii="Aptos" w:hAnsi="Aptos"/>
+        </w:rPr>
+        <w:t>the</w:t>
+      </w:r>
+      <w:r>
+        <w:rPr>
+          <w:rFonts w:ascii="Aptos" w:hAnsi="Aptos"/>
+        </w:rPr>
+        <w:t xml:space="preserve"> sensitivity</w:t>
+      </w:r>
+      <w:r>
+        <w:rPr>
+          <w:rFonts w:ascii="Aptos" w:hAnsi="Aptos"/>
+        </w:rPr>
+        <w:t xml:space="preserve"> of the clouds</w:t>
+      </w:r>
+      <w:r>
+        <w:rPr>
+          <w:rFonts w:ascii="Aptos" w:hAnsi="Aptos"/>
+        </w:rPr>
+        <w:t xml:space="preserve"> to the mean RH, RH gradients, and moisture flux</w:t>
       </w:r>
       <w:r>
         <w:rPr>

</xml_diff>